<commit_message>
Update PPE Word docs for warning workflow
</commit_message>
<xml_diff>
--- a/docs/[캡스톤디자인] PPE 분석 시스템 구조 및 데이터 설계.docx
+++ b/docs/[캡스톤디자인] PPE 분석 시스템 구조 및 데이터 설계.docx
@@ -29,7 +29,13 @@
         <w:t>(</w:t>
       </w:r>
       <w:r>
-        <w:t>2026.04.07</w:t>
+        <w:t>2026.0</w:t>
+      </w:r>
+      <w:r>
+        <w:t>5</w:t>
+      </w:r>
+      <w:r>
+        <w:t>.07</w:t>
       </w:r>
       <w:r>
         <w:t>)</w:t>
@@ -63,12 +69,366 @@
       </w:r>
       <w:r>
         <w:t xml:space="preserve"> 범위: 안전모, 안전조끼를 초기 핵심 대상으로 하며, 장갑 및 보안경은 후속 확장 대상으로 둔다.</w:t>
+      </w:r>
+    </w:p>
+    <w:p/>
+    <w:p>
+      <w:pPr>
+        <w:widowControl/>
+        <w:wordWrap/>
+        <w:autoSpaceDE/>
+        <w:autoSpaceDN/>
+        <w:spacing w:before="100" w:beforeAutospacing="1" w:after="100" w:afterAutospacing="1" w:line="240" w:lineRule="auto"/>
+        <w:jc w:val="left"/>
+        <w:outlineLvl w:val="0"/>
+        <w:rPr>
+          <w:rFonts w:eastAsiaTheme="minorHAnsi" w:cs="굴림"/>
+          <w:b/>
+          <w:bCs/>
+          <w:kern w:val="36"/>
+          <w:sz w:val="48"/>
+          <w:szCs w:val="48"/>
+        </w:rPr>
+      </w:pPr>
+      <w:r>
+        <w:rPr>
+          <w:rFonts w:eastAsiaTheme="minorHAnsi" w:cs="굴림"/>
+          <w:b/>
+          <w:bCs/>
+          <w:kern w:val="36"/>
+          <w:sz w:val="48"/>
+          <w:szCs w:val="48"/>
+        </w:rPr>
+        <w:t xml:space="preserve">1. </w:t>
+      </w:r>
+      <w:r>
+        <w:rPr>
+          <w:rFonts w:eastAsiaTheme="minorHAnsi" w:cs="굴림"/>
+          <w:b/>
+          <w:bCs/>
+          <w:kern w:val="36"/>
+          <w:sz w:val="44"/>
+          <w:szCs w:val="44"/>
+        </w:rPr>
+        <w:t>공장 전체 기준 분기별 분석 구조 설계</w:t>
       </w:r>
     </w:p>
     <w:p>
       <w:pPr>
-        <w:rPr>
-          <w:rFonts w:hint="eastAsia"/>
+        <w:widowControl/>
+        <w:wordWrap/>
+        <w:autoSpaceDE/>
+        <w:autoSpaceDN/>
+        <w:spacing w:before="100" w:beforeAutospacing="1" w:after="100" w:afterAutospacing="1" w:line="240" w:lineRule="auto"/>
+        <w:jc w:val="left"/>
+        <w:rPr>
+          <w:rFonts w:eastAsiaTheme="minorHAnsi" w:cs="굴림"/>
+          <w:kern w:val="0"/>
+          <w:sz w:val="24"/>
+          <w:szCs w:val="24"/>
+        </w:rPr>
+      </w:pPr>
+      <w:r>
+        <w:rPr>
+          <w:rFonts w:eastAsiaTheme="minorHAnsi" w:cs="굴림"/>
+          <w:kern w:val="0"/>
+          <w:sz w:val="24"/>
+          <w:szCs w:val="24"/>
+        </w:rPr>
+        <w:t xml:space="preserve">본 프로젝트의 분석 대상은 </w:t>
+      </w:r>
+      <w:r>
+        <w:rPr>
+          <w:rFonts w:eastAsiaTheme="minorHAnsi" w:cs="굴림"/>
+          <w:b/>
+          <w:bCs/>
+          <w:kern w:val="0"/>
+          <w:sz w:val="24"/>
+          <w:szCs w:val="24"/>
+        </w:rPr>
+        <w:t>금속 및 기계 제조 공장</w:t>
+      </w:r>
+      <w:r>
+        <w:rPr>
+          <w:rFonts w:eastAsiaTheme="minorHAnsi" w:cs="굴림"/>
+          <w:kern w:val="0"/>
+          <w:sz w:val="24"/>
+          <w:szCs w:val="24"/>
+        </w:rPr>
+        <w:t xml:space="preserve">으로 설정하였다. 구체적으로는 유압 프레스, 절삭기, 선반, </w:t>
+      </w:r>
+      <w:proofErr w:type="spellStart"/>
+      <w:r>
+        <w:rPr>
+          <w:rFonts w:eastAsiaTheme="minorHAnsi" w:cs="굴림"/>
+          <w:kern w:val="0"/>
+          <w:sz w:val="24"/>
+          <w:szCs w:val="24"/>
+        </w:rPr>
+        <w:t>밀링</w:t>
+      </w:r>
+      <w:proofErr w:type="spellEnd"/>
+      <w:r>
+        <w:rPr>
+          <w:rFonts w:eastAsiaTheme="minorHAnsi" w:cs="굴림"/>
+          <w:kern w:val="0"/>
+          <w:sz w:val="24"/>
+          <w:szCs w:val="24"/>
+        </w:rPr>
+        <w:t xml:space="preserve">, 성형기 등 금속을 성형하거나 절삭하는 공정을 포함하는 현장을 가정하였다. 이러한 환경은 회전체, 중량물, 금속 </w:t>
+      </w:r>
+      <w:proofErr w:type="spellStart"/>
+      <w:r>
+        <w:rPr>
+          <w:rFonts w:eastAsiaTheme="minorHAnsi" w:cs="굴림"/>
+          <w:kern w:val="0"/>
+          <w:sz w:val="24"/>
+          <w:szCs w:val="24"/>
+        </w:rPr>
+        <w:t>비산물</w:t>
+      </w:r>
+      <w:proofErr w:type="spellEnd"/>
+      <w:r>
+        <w:rPr>
+          <w:rFonts w:eastAsiaTheme="minorHAnsi" w:cs="굴림"/>
+          <w:kern w:val="0"/>
+          <w:sz w:val="24"/>
+          <w:szCs w:val="24"/>
+        </w:rPr>
+        <w:t xml:space="preserve">, 설비 접근, 협소한 작업공간 등으로 인해 기본적인 PPE 착용의 중요성이 높으며, 특히 </w:t>
+      </w:r>
+      <w:r>
+        <w:rPr>
+          <w:rFonts w:eastAsiaTheme="minorHAnsi" w:cs="굴림"/>
+          <w:b/>
+          <w:bCs/>
+          <w:kern w:val="0"/>
+          <w:sz w:val="24"/>
+          <w:szCs w:val="24"/>
+        </w:rPr>
+        <w:t>머리 보호구, 작업복/조끼, 눈 보호구, 장갑</w:t>
+      </w:r>
+      <w:r>
+        <w:rPr>
+          <w:rFonts w:eastAsiaTheme="minorHAnsi" w:cs="굴림"/>
+          <w:kern w:val="0"/>
+          <w:sz w:val="24"/>
+          <w:szCs w:val="24"/>
+        </w:rPr>
+        <w:t xml:space="preserve">과 같은 항목이 위험 평가와 연계되어 관리될 필요가 있다. </w:t>
+      </w:r>
+      <w:r>
+        <w:rPr>
+          <w:rFonts w:eastAsiaTheme="minorHAnsi" w:cs="굴림"/>
+          <w:kern w:val="0"/>
+          <w:sz w:val="24"/>
+          <w:szCs w:val="24"/>
+        </w:rPr>
+        <w:br/>
+      </w:r>
+      <w:r>
+        <w:rPr>
+          <w:rFonts w:eastAsiaTheme="minorHAnsi" w:cs="굴림"/>
+          <w:kern w:val="0"/>
+          <w:sz w:val="24"/>
+          <w:szCs w:val="24"/>
+        </w:rPr>
+        <w:t xml:space="preserve">OSHA 역시 PPE 운용에서 작업장 위험 평가를 선행하고, 그 결과에 따라 필요한 PPE를 정하도록 제시한다. </w:t>
+      </w:r>
+    </w:p>
+    <w:p>
+      <w:pPr>
+        <w:widowControl/>
+        <w:wordWrap/>
+        <w:autoSpaceDE/>
+        <w:autoSpaceDN/>
+        <w:spacing w:before="100" w:beforeAutospacing="1" w:after="100" w:afterAutospacing="1" w:line="240" w:lineRule="auto"/>
+        <w:jc w:val="left"/>
+        <w:rPr>
+          <w:rFonts w:eastAsiaTheme="minorHAnsi" w:cs="굴림"/>
+          <w:kern w:val="0"/>
+          <w:sz w:val="24"/>
+          <w:szCs w:val="24"/>
+        </w:rPr>
+      </w:pPr>
+      <w:r>
+        <w:rPr>
+          <w:rFonts w:eastAsiaTheme="minorHAnsi" w:cs="굴림" w:hint="eastAsia"/>
+          <w:kern w:val="0"/>
+          <w:sz w:val="24"/>
+          <w:szCs w:val="24"/>
+        </w:rPr>
+        <w:t>본</w:t>
+      </w:r>
+      <w:r>
+        <w:rPr>
+          <w:rFonts w:eastAsiaTheme="minorHAnsi" w:cs="굴림"/>
+          <w:kern w:val="0"/>
+          <w:sz w:val="24"/>
+          <w:szCs w:val="24"/>
+        </w:rPr>
+        <w:t xml:space="preserve"> 시스템은 PPE 미착용 상황을 감지한 뒤 현장에 중립적 경고 방송을 송출하고, 해당 이벤트를 임시 저장한 뒤 </w:t>
+      </w:r>
+      <w:r>
+        <w:rPr>
+          <w:rFonts w:eastAsiaTheme="minorHAnsi" w:cs="굴림" w:hint="eastAsia"/>
+          <w:kern w:val="0"/>
+          <w:sz w:val="24"/>
+          <w:szCs w:val="24"/>
+        </w:rPr>
+        <w:t>담당자가</w:t>
+      </w:r>
+      <w:r>
+        <w:rPr>
+          <w:rFonts w:eastAsiaTheme="minorHAnsi" w:cs="굴림"/>
+          <w:kern w:val="0"/>
+          <w:sz w:val="24"/>
+          <w:szCs w:val="24"/>
+        </w:rPr>
+        <w:t xml:space="preserve"> 최종 검토하는 구조로 운영한다.</w:t>
+      </w:r>
+    </w:p>
+    <w:p>
+      <w:pPr>
+        <w:widowControl/>
+        <w:wordWrap/>
+        <w:autoSpaceDE/>
+        <w:autoSpaceDN/>
+        <w:spacing w:before="100" w:beforeAutospacing="1" w:after="100" w:afterAutospacing="1" w:line="240" w:lineRule="auto"/>
+        <w:jc w:val="left"/>
+        <w:rPr>
+          <w:rFonts w:eastAsiaTheme="minorHAnsi" w:cs="굴림"/>
+          <w:kern w:val="0"/>
+          <w:sz w:val="24"/>
+          <w:szCs w:val="24"/>
+        </w:rPr>
+      </w:pPr>
+      <w:r>
+        <w:rPr>
+          <w:rFonts w:eastAsiaTheme="minorHAnsi" w:cs="굴림" w:hint="eastAsia"/>
+          <w:kern w:val="0"/>
+          <w:sz w:val="24"/>
+          <w:szCs w:val="24"/>
+        </w:rPr>
+        <w:t>담당자</w:t>
+      </w:r>
+      <w:r>
+        <w:rPr>
+          <w:rFonts w:eastAsiaTheme="minorHAnsi" w:cs="굴림"/>
+          <w:kern w:val="0"/>
+          <w:sz w:val="24"/>
+          <w:szCs w:val="24"/>
+        </w:rPr>
+        <w:t xml:space="preserve"> 검토 결과 </w:t>
+      </w:r>
+      <w:proofErr w:type="spellStart"/>
+      <w:r>
+        <w:rPr>
+          <w:rFonts w:eastAsiaTheme="minorHAnsi" w:cs="굴림"/>
+          <w:kern w:val="0"/>
+          <w:sz w:val="24"/>
+          <w:szCs w:val="24"/>
+        </w:rPr>
+        <w:t>오탐으로</w:t>
+      </w:r>
+      <w:proofErr w:type="spellEnd"/>
+      <w:r>
+        <w:rPr>
+          <w:rFonts w:eastAsiaTheme="minorHAnsi" w:cs="굴림"/>
+          <w:kern w:val="0"/>
+          <w:sz w:val="24"/>
+          <w:szCs w:val="24"/>
+        </w:rPr>
+        <w:t xml:space="preserve"> 판단된 이벤트는 삭제하며, 확정 위반으로 판단된 이벤트는 원본 이미지와 영상은 삭제하고 구역, 공정, PPE 유형, 발생 시각, 검토 결과 등 </w:t>
+      </w:r>
+      <w:proofErr w:type="spellStart"/>
+      <w:r>
+        <w:rPr>
+          <w:rFonts w:eastAsiaTheme="minorHAnsi" w:cs="굴림"/>
+          <w:kern w:val="0"/>
+          <w:sz w:val="24"/>
+          <w:szCs w:val="24"/>
+        </w:rPr>
+        <w:t>비식별</w:t>
+      </w:r>
+      <w:proofErr w:type="spellEnd"/>
+      <w:r>
+        <w:rPr>
+          <w:rFonts w:eastAsiaTheme="minorHAnsi" w:cs="굴림"/>
+          <w:kern w:val="0"/>
+          <w:sz w:val="24"/>
+          <w:szCs w:val="24"/>
+        </w:rPr>
+        <w:t xml:space="preserve"> 데이터만 저장한다.</w:t>
+      </w:r>
+    </w:p>
+    <w:p>
+      <w:pPr>
+        <w:widowControl/>
+        <w:wordWrap/>
+        <w:autoSpaceDE/>
+        <w:autoSpaceDN/>
+        <w:spacing w:before="100" w:beforeAutospacing="1" w:after="100" w:afterAutospacing="1" w:line="240" w:lineRule="auto"/>
+        <w:jc w:val="left"/>
+        <w:rPr>
+          <w:rFonts w:eastAsiaTheme="minorHAnsi" w:cs="굴림"/>
+          <w:kern w:val="0"/>
+          <w:sz w:val="24"/>
+          <w:szCs w:val="24"/>
+        </w:rPr>
+      </w:pPr>
+      <w:r>
+        <w:rPr>
+          <w:rFonts w:eastAsiaTheme="minorHAnsi" w:cs="굴림" w:hint="eastAsia"/>
+          <w:kern w:val="0"/>
+          <w:sz w:val="24"/>
+          <w:szCs w:val="24"/>
+        </w:rPr>
+        <w:t>분기별</w:t>
+      </w:r>
+      <w:r>
+        <w:rPr>
+          <w:rFonts w:eastAsiaTheme="minorHAnsi" w:cs="굴림"/>
+          <w:kern w:val="0"/>
+          <w:sz w:val="24"/>
+          <w:szCs w:val="24"/>
+        </w:rPr>
+        <w:t xml:space="preserve"> 통계 및 교육 추천은 원본 영상이나 식별 가능한 이미지가 아니라, 감독관 검토를 거친 </w:t>
+      </w:r>
+      <w:proofErr w:type="spellStart"/>
+      <w:r>
+        <w:rPr>
+          <w:rFonts w:eastAsiaTheme="minorHAnsi" w:cs="굴림"/>
+          <w:kern w:val="0"/>
+          <w:sz w:val="24"/>
+          <w:szCs w:val="24"/>
+        </w:rPr>
+        <w:t>비식별</w:t>
+      </w:r>
+      <w:proofErr w:type="spellEnd"/>
+      <w:r>
+        <w:rPr>
+          <w:rFonts w:eastAsiaTheme="minorHAnsi" w:cs="굴림"/>
+          <w:kern w:val="0"/>
+          <w:sz w:val="24"/>
+          <w:szCs w:val="24"/>
+        </w:rPr>
+        <w:t xml:space="preserve"> 확정 위반 데이터를 기준으로 수행한다.</w:t>
+      </w:r>
+    </w:p>
+    <w:p>
+      <w:pPr>
+        <w:widowControl/>
+        <w:wordWrap/>
+        <w:autoSpaceDE/>
+        <w:autoSpaceDN/>
+        <w:spacing w:before="100" w:beforeAutospacing="1" w:after="100" w:afterAutospacing="1" w:line="240" w:lineRule="auto"/>
+        <w:jc w:val="left"/>
+        <w:rPr>
+          <w:rFonts w:eastAsiaTheme="minorHAnsi" w:cs="굴림"/>
+          <w:kern w:val="0"/>
+          <w:sz w:val="24"/>
+          <w:szCs w:val="24"/>
         </w:rPr>
       </w:pPr>
     </w:p>
@@ -80,338 +440,8 @@
         <w:autoSpaceDN/>
         <w:spacing w:before="100" w:beforeAutospacing="1" w:after="100" w:afterAutospacing="1" w:line="240" w:lineRule="auto"/>
         <w:jc w:val="left"/>
-        <w:outlineLvl w:val="0"/>
         <w:rPr>
           <w:rFonts w:eastAsiaTheme="minorHAnsi" w:cs="굴림"/>
-          <w:b/>
-          <w:bCs/>
-          <w:kern w:val="36"/>
-          <w:sz w:val="48"/>
-          <w:szCs w:val="48"/>
-        </w:rPr>
-      </w:pPr>
-      <w:r>
-        <w:rPr>
-          <w:rFonts w:eastAsiaTheme="minorHAnsi" w:cs="굴림"/>
-          <w:b/>
-          <w:bCs/>
-          <w:kern w:val="36"/>
-          <w:sz w:val="48"/>
-          <w:szCs w:val="48"/>
-        </w:rPr>
-        <w:t xml:space="preserve">1. </w:t>
-      </w:r>
-      <w:r>
-        <w:rPr>
-          <w:rFonts w:eastAsiaTheme="minorHAnsi" w:cs="굴림"/>
-          <w:b/>
-          <w:bCs/>
-          <w:kern w:val="36"/>
-          <w:sz w:val="44"/>
-          <w:szCs w:val="44"/>
-        </w:rPr>
-        <w:t>공장 전체 기준 분기별 분석 구조 설계</w:t>
-      </w:r>
-    </w:p>
-    <w:p>
-      <w:pPr>
-        <w:widowControl/>
-        <w:wordWrap/>
-        <w:autoSpaceDE/>
-        <w:autoSpaceDN/>
-        <w:spacing w:before="100" w:beforeAutospacing="1" w:after="100" w:afterAutospacing="1" w:line="240" w:lineRule="auto"/>
-        <w:jc w:val="left"/>
-        <w:rPr>
-          <w:rFonts w:eastAsiaTheme="minorHAnsi" w:cs="굴림"/>
-          <w:kern w:val="0"/>
-          <w:sz w:val="24"/>
-          <w:szCs w:val="24"/>
-        </w:rPr>
-      </w:pPr>
-      <w:r>
-        <w:rPr>
-          <w:rFonts w:eastAsiaTheme="minorHAnsi" w:cs="굴림"/>
-          <w:kern w:val="0"/>
-          <w:sz w:val="24"/>
-          <w:szCs w:val="24"/>
-        </w:rPr>
-        <w:t xml:space="preserve">본 프로젝트의 분석 대상은 </w:t>
-      </w:r>
-      <w:r>
-        <w:rPr>
-          <w:rFonts w:eastAsiaTheme="minorHAnsi" w:cs="굴림"/>
-          <w:b/>
-          <w:bCs/>
-          <w:kern w:val="0"/>
-          <w:sz w:val="24"/>
-          <w:szCs w:val="24"/>
-        </w:rPr>
-        <w:t>금속 및 기계 제조 공장</w:t>
-      </w:r>
-      <w:r>
-        <w:rPr>
-          <w:rFonts w:eastAsiaTheme="minorHAnsi" w:cs="굴림"/>
-          <w:kern w:val="0"/>
-          <w:sz w:val="24"/>
-          <w:szCs w:val="24"/>
-        </w:rPr>
-        <w:t xml:space="preserve">으로 설정하였다. 구체적으로는 유압 프레스, 절삭기, 선반, </w:t>
-      </w:r>
-      <w:proofErr w:type="spellStart"/>
-      <w:r>
-        <w:rPr>
-          <w:rFonts w:eastAsiaTheme="minorHAnsi" w:cs="굴림"/>
-          <w:kern w:val="0"/>
-          <w:sz w:val="24"/>
-          <w:szCs w:val="24"/>
-        </w:rPr>
-        <w:t>밀링</w:t>
-      </w:r>
-      <w:proofErr w:type="spellEnd"/>
-      <w:r>
-        <w:rPr>
-          <w:rFonts w:eastAsiaTheme="minorHAnsi" w:cs="굴림"/>
-          <w:kern w:val="0"/>
-          <w:sz w:val="24"/>
-          <w:szCs w:val="24"/>
-        </w:rPr>
-        <w:t xml:space="preserve">, 성형기 등 금속을 성형하거나 절삭하는 공정을 포함하는 현장을 가정하였다. 이러한 환경은 회전체, 중량물, 금속 </w:t>
-      </w:r>
-      <w:proofErr w:type="spellStart"/>
-      <w:r>
-        <w:rPr>
-          <w:rFonts w:eastAsiaTheme="minorHAnsi" w:cs="굴림"/>
-          <w:kern w:val="0"/>
-          <w:sz w:val="24"/>
-          <w:szCs w:val="24"/>
-        </w:rPr>
-        <w:t>비산물</w:t>
-      </w:r>
-      <w:proofErr w:type="spellEnd"/>
-      <w:r>
-        <w:rPr>
-          <w:rFonts w:eastAsiaTheme="minorHAnsi" w:cs="굴림"/>
-          <w:kern w:val="0"/>
-          <w:sz w:val="24"/>
-          <w:szCs w:val="24"/>
-        </w:rPr>
-        <w:t xml:space="preserve">, 설비 접근, 협소한 작업공간 등으로 인해 기본적인 PPE 착용의 중요성이 높으며, 특히 </w:t>
-      </w:r>
-      <w:r>
-        <w:rPr>
-          <w:rFonts w:eastAsiaTheme="minorHAnsi" w:cs="굴림"/>
-          <w:b/>
-          <w:bCs/>
-          <w:kern w:val="0"/>
-          <w:sz w:val="24"/>
-          <w:szCs w:val="24"/>
-        </w:rPr>
-        <w:t>머리 보호구, 작업복/조끼, 눈 보호구, 장갑</w:t>
-      </w:r>
-      <w:r>
-        <w:rPr>
-          <w:rFonts w:eastAsiaTheme="minorHAnsi" w:cs="굴림"/>
-          <w:kern w:val="0"/>
-          <w:sz w:val="24"/>
-          <w:szCs w:val="24"/>
-        </w:rPr>
-        <w:t xml:space="preserve">과 같은 항목이 위험 평가와 연계되어 관리될 필요가 있다. </w:t>
-      </w:r>
-      <w:r>
-        <w:rPr>
-          <w:rFonts w:eastAsiaTheme="minorHAnsi" w:cs="굴림"/>
-          <w:kern w:val="0"/>
-          <w:sz w:val="24"/>
-          <w:szCs w:val="24"/>
-        </w:rPr>
-        <w:br/>
-      </w:r>
-      <w:r>
-        <w:rPr>
-          <w:rFonts w:eastAsiaTheme="minorHAnsi" w:cs="굴림"/>
-          <w:kern w:val="0"/>
-          <w:sz w:val="24"/>
-          <w:szCs w:val="24"/>
-        </w:rPr>
-        <w:t xml:space="preserve">OSHA 역시 PPE 운용에서 작업장 위험 평가를 선행하고, 그 결과에 따라 필요한 PPE를 정하도록 제시한다. </w:t>
-      </w:r>
-    </w:p>
-    <w:p>
-      <w:pPr>
-        <w:widowControl/>
-        <w:wordWrap/>
-        <w:autoSpaceDE/>
-        <w:autoSpaceDN/>
-        <w:spacing w:before="100" w:beforeAutospacing="1" w:after="100" w:afterAutospacing="1" w:line="240" w:lineRule="auto"/>
-        <w:jc w:val="left"/>
-        <w:rPr>
-          <w:rFonts w:eastAsiaTheme="minorHAnsi" w:cs="굴림"/>
-          <w:kern w:val="0"/>
-          <w:sz w:val="24"/>
-          <w:szCs w:val="24"/>
-        </w:rPr>
-      </w:pPr>
-      <w:r>
-        <w:rPr>
-          <w:rFonts w:eastAsiaTheme="minorHAnsi" w:cs="굴림"/>
-          <w:kern w:val="0"/>
-          <w:sz w:val="24"/>
-          <w:szCs w:val="24"/>
-        </w:rPr>
-        <w:t xml:space="preserve">본 프로젝트는 특정 작업자를 실시간으로 추적하여 개인별 위반을 관리하는 시스템이 아니라, </w:t>
-      </w:r>
-      <w:r>
-        <w:rPr>
-          <w:rFonts w:eastAsiaTheme="minorHAnsi" w:cs="굴림"/>
-          <w:b/>
-          <w:bCs/>
-          <w:kern w:val="0"/>
-          <w:sz w:val="24"/>
-          <w:szCs w:val="24"/>
-        </w:rPr>
-        <w:t xml:space="preserve">공장 전체 차원에서 반복적으로 나타나는 PPE </w:t>
-      </w:r>
-      <w:proofErr w:type="spellStart"/>
-      <w:r>
-        <w:rPr>
-          <w:rFonts w:eastAsiaTheme="minorHAnsi" w:cs="굴림"/>
-          <w:b/>
-          <w:bCs/>
-          <w:kern w:val="0"/>
-          <w:sz w:val="24"/>
-          <w:szCs w:val="24"/>
-        </w:rPr>
-        <w:t>미준수</w:t>
-      </w:r>
-      <w:proofErr w:type="spellEnd"/>
-      <w:r>
-        <w:rPr>
-          <w:rFonts w:eastAsiaTheme="minorHAnsi" w:cs="굴림"/>
-          <w:b/>
-          <w:bCs/>
-          <w:kern w:val="0"/>
-          <w:sz w:val="24"/>
-          <w:szCs w:val="24"/>
-        </w:rPr>
-        <w:t xml:space="preserve"> 경향을 분기별로 누적 분석하고, 이를 기반으로 교육 우선순위를 추천하는 시스템</w:t>
-      </w:r>
-      <w:r>
-        <w:rPr>
-          <w:rFonts w:eastAsiaTheme="minorHAnsi" w:cs="굴림"/>
-          <w:kern w:val="0"/>
-          <w:sz w:val="24"/>
-          <w:szCs w:val="24"/>
-        </w:rPr>
-        <w:t xml:space="preserve">으로 설계하였다. 따라서 분석 단위는 단일 프레임이 아니라 </w:t>
-      </w:r>
-      <w:r>
-        <w:rPr>
-          <w:rFonts w:eastAsiaTheme="minorHAnsi" w:cs="굴림"/>
-          <w:b/>
-          <w:bCs/>
-          <w:kern w:val="0"/>
-          <w:sz w:val="24"/>
-          <w:szCs w:val="24"/>
-        </w:rPr>
-        <w:t>후보 이벤트</w:t>
-      </w:r>
-      <w:r>
-        <w:rPr>
-          <w:rFonts w:eastAsiaTheme="minorHAnsi" w:cs="굴림"/>
-          <w:kern w:val="0"/>
-          <w:sz w:val="24"/>
-          <w:szCs w:val="24"/>
-        </w:rPr>
-        <w:t xml:space="preserve">와 </w:t>
-      </w:r>
-      <w:r>
-        <w:rPr>
-          <w:rFonts w:eastAsiaTheme="minorHAnsi" w:cs="굴림"/>
-          <w:kern w:val="0"/>
-          <w:sz w:val="24"/>
-          <w:szCs w:val="24"/>
-        </w:rPr>
-        <w:br/>
-      </w:r>
-      <w:r>
-        <w:rPr>
-          <w:rFonts w:eastAsiaTheme="minorHAnsi" w:cs="굴림"/>
-          <w:b/>
-          <w:bCs/>
-          <w:kern w:val="0"/>
-          <w:sz w:val="24"/>
-          <w:szCs w:val="24"/>
-        </w:rPr>
-        <w:t>검토 확정 사건</w:t>
-      </w:r>
-      <w:r>
-        <w:rPr>
-          <w:rFonts w:eastAsiaTheme="minorHAnsi" w:cs="굴림"/>
-          <w:kern w:val="0"/>
-          <w:sz w:val="24"/>
-          <w:szCs w:val="24"/>
-        </w:rPr>
-        <w:t xml:space="preserve"> 중심으로 구성하였다.</w:t>
-      </w:r>
-    </w:p>
-    <w:p>
-      <w:pPr>
-        <w:widowControl/>
-        <w:wordWrap/>
-        <w:autoSpaceDE/>
-        <w:autoSpaceDN/>
-        <w:spacing w:before="100" w:beforeAutospacing="1" w:after="100" w:afterAutospacing="1" w:line="240" w:lineRule="auto"/>
-        <w:jc w:val="left"/>
-        <w:rPr>
-          <w:rFonts w:eastAsiaTheme="minorHAnsi" w:cs="굴림"/>
-          <w:kern w:val="0"/>
-          <w:sz w:val="24"/>
-          <w:szCs w:val="24"/>
-        </w:rPr>
-      </w:pPr>
-    </w:p>
-    <w:p>
-      <w:pPr>
-        <w:widowControl/>
-        <w:wordWrap/>
-        <w:autoSpaceDE/>
-        <w:autoSpaceDN/>
-        <w:spacing w:before="100" w:beforeAutospacing="1" w:after="100" w:afterAutospacing="1" w:line="240" w:lineRule="auto"/>
-        <w:jc w:val="left"/>
-        <w:rPr>
-          <w:rFonts w:eastAsiaTheme="minorHAnsi" w:cs="굴림"/>
-          <w:kern w:val="0"/>
-          <w:sz w:val="24"/>
-          <w:szCs w:val="24"/>
-        </w:rPr>
-      </w:pPr>
-    </w:p>
-    <w:p>
-      <w:pPr>
-        <w:widowControl/>
-        <w:wordWrap/>
-        <w:autoSpaceDE/>
-        <w:autoSpaceDN/>
-        <w:spacing w:before="100" w:beforeAutospacing="1" w:after="100" w:afterAutospacing="1" w:line="240" w:lineRule="auto"/>
-        <w:jc w:val="left"/>
-        <w:rPr>
-          <w:rFonts w:eastAsiaTheme="minorHAnsi" w:cs="굴림"/>
-          <w:kern w:val="0"/>
-          <w:sz w:val="24"/>
-          <w:szCs w:val="24"/>
-        </w:rPr>
-      </w:pPr>
-    </w:p>
-    <w:p>
-      <w:pPr>
-        <w:widowControl/>
-        <w:wordWrap/>
-        <w:autoSpaceDE/>
-        <w:autoSpaceDN/>
-        <w:spacing w:before="100" w:beforeAutospacing="1" w:after="100" w:afterAutospacing="1" w:line="240" w:lineRule="auto"/>
-        <w:jc w:val="left"/>
-        <w:rPr>
-          <w:rFonts w:eastAsiaTheme="minorHAnsi" w:cs="굴림" w:hint="eastAsia"/>
           <w:kern w:val="0"/>
           <w:sz w:val="24"/>
           <w:szCs w:val="24"/>
@@ -460,7 +490,7 @@
       </w:tblPr>
       <w:tblGrid>
         <w:gridCol w:w="565"/>
-        <w:gridCol w:w="8456"/>
+        <w:gridCol w:w="8461"/>
       </w:tblGrid>
       <w:tr>
         <w:trPr>
@@ -913,26 +943,25 @@
           <w:tcPr>
             <w:tcW w:w="0" w:type="auto"/>
             <w:vAlign w:val="center"/>
-            <w:hideMark/>
-          </w:tcPr>
-          <w:p>
-            <w:pPr>
-              <w:widowControl/>
-              <w:wordWrap/>
-              <w:autoSpaceDE/>
-              <w:autoSpaceDN/>
-              <w:spacing w:after="0" w:line="240" w:lineRule="auto"/>
-              <w:jc w:val="center"/>
-              <w:rPr>
-                <w:rFonts w:eastAsiaTheme="minorHAnsi" w:cs="굴림"/>
-                <w:kern w:val="0"/>
-                <w:sz w:val="24"/>
-                <w:szCs w:val="24"/>
-              </w:rPr>
-            </w:pPr>
-            <w:r>
-              <w:rPr>
-                <w:rFonts w:eastAsiaTheme="minorHAnsi" w:cs="굴림"/>
+          </w:tcPr>
+          <w:p>
+            <w:pPr>
+              <w:widowControl/>
+              <w:wordWrap/>
+              <w:autoSpaceDE/>
+              <w:autoSpaceDN/>
+              <w:spacing w:after="0" w:line="240" w:lineRule="auto"/>
+              <w:jc w:val="center"/>
+              <w:rPr>
+                <w:rFonts w:eastAsiaTheme="minorHAnsi" w:cs="굴림"/>
+                <w:kern w:val="0"/>
+                <w:sz w:val="24"/>
+                <w:szCs w:val="24"/>
+              </w:rPr>
+            </w:pPr>
+            <w:r>
+              <w:rPr>
+                <w:rFonts w:eastAsiaTheme="minorHAnsi" w:cs="굴림" w:hint="eastAsia"/>
                 <w:kern w:val="0"/>
                 <w:sz w:val="24"/>
                 <w:szCs w:val="24"/>
@@ -945,31 +974,39 @@
           <w:tcPr>
             <w:tcW w:w="0" w:type="auto"/>
             <w:vAlign w:val="center"/>
-            <w:hideMark/>
-          </w:tcPr>
-          <w:p>
-            <w:pPr>
-              <w:widowControl/>
-              <w:wordWrap/>
-              <w:autoSpaceDE/>
-              <w:autoSpaceDN/>
-              <w:spacing w:after="0" w:line="240" w:lineRule="auto"/>
-              <w:jc w:val="center"/>
-              <w:rPr>
-                <w:rFonts w:eastAsiaTheme="minorHAnsi" w:cs="굴림"/>
-                <w:kern w:val="0"/>
-                <w:sz w:val="24"/>
-                <w:szCs w:val="24"/>
-              </w:rPr>
-            </w:pPr>
-            <w:r>
-              <w:rPr>
-                <w:rFonts w:eastAsiaTheme="minorHAnsi" w:cs="굴림"/>
-                <w:kern w:val="0"/>
-                <w:sz w:val="24"/>
-                <w:szCs w:val="24"/>
-              </w:rPr>
-              <w:t>같은 위반 상태가 연속될 경우 하나의 이벤트로 병합한다.</w:t>
+          </w:tcPr>
+          <w:p>
+            <w:pPr>
+              <w:widowControl/>
+              <w:wordWrap/>
+              <w:autoSpaceDE/>
+              <w:autoSpaceDN/>
+              <w:spacing w:after="0" w:line="240" w:lineRule="auto"/>
+              <w:jc w:val="center"/>
+              <w:rPr>
+                <w:rFonts w:eastAsiaTheme="minorHAnsi" w:cs="굴림"/>
+                <w:kern w:val="0"/>
+                <w:sz w:val="24"/>
+                <w:szCs w:val="24"/>
+              </w:rPr>
+            </w:pPr>
+            <w:r>
+              <w:rPr>
+                <w:rFonts w:eastAsiaTheme="minorHAnsi" w:cs="굴림" w:hint="eastAsia"/>
+                <w:kern w:val="0"/>
+                <w:sz w:val="24"/>
+                <w:szCs w:val="24"/>
+              </w:rPr>
+              <w:t>현장에</w:t>
+            </w:r>
+            <w:r>
+              <w:rPr>
+                <w:rFonts w:eastAsiaTheme="minorHAnsi" w:cs="굴림"/>
+                <w:kern w:val="0"/>
+                <w:sz w:val="24"/>
+                <w:szCs w:val="24"/>
+              </w:rPr>
+              <w:t xml:space="preserve"> 중립적 경고 방송을 송출한다.</w:t>
             </w:r>
           </w:p>
         </w:tc>
@@ -1001,7 +1038,7 @@
             </w:pPr>
             <w:r>
               <w:rPr>
-                <w:rFonts w:eastAsiaTheme="minorHAnsi" w:cs="굴림"/>
+                <w:rFonts w:eastAsiaTheme="minorHAnsi" w:cs="굴림" w:hint="eastAsia"/>
                 <w:kern w:val="0"/>
                 <w:sz w:val="24"/>
                 <w:szCs w:val="24"/>
@@ -1033,32 +1070,55 @@
             </w:pPr>
             <w:r>
               <w:rPr>
-                <w:rFonts w:eastAsiaTheme="minorHAnsi" w:cs="굴림"/>
-                <w:kern w:val="0"/>
-                <w:sz w:val="24"/>
-                <w:szCs w:val="24"/>
-              </w:rPr>
-              <w:t xml:space="preserve">담당자가 후보 이벤트를 검토하여 확정 위반, </w:t>
-            </w:r>
-            <w:proofErr w:type="spellStart"/>
-            <w:r>
-              <w:rPr>
-                <w:rFonts w:eastAsiaTheme="minorHAnsi" w:cs="굴림"/>
-                <w:kern w:val="0"/>
-                <w:sz w:val="24"/>
-                <w:szCs w:val="24"/>
-              </w:rPr>
-              <w:t>오탐</w:t>
-            </w:r>
-            <w:proofErr w:type="spellEnd"/>
-            <w:r>
-              <w:rPr>
-                <w:rFonts w:eastAsiaTheme="minorHAnsi" w:cs="굴림"/>
-                <w:kern w:val="0"/>
-                <w:sz w:val="24"/>
-                <w:szCs w:val="24"/>
-              </w:rPr>
-              <w:t>, 판단 보류로 분류한다.</w:t>
+                <w:rFonts w:eastAsiaTheme="minorHAnsi" w:cs="굴림" w:hint="eastAsia"/>
+                <w:kern w:val="0"/>
+                <w:sz w:val="24"/>
+                <w:szCs w:val="24"/>
+              </w:rPr>
+              <w:t>경고가</w:t>
+            </w:r>
+            <w:r>
+              <w:rPr>
+                <w:rFonts w:eastAsiaTheme="minorHAnsi" w:cs="굴림"/>
+                <w:kern w:val="0"/>
+                <w:sz w:val="24"/>
+                <w:szCs w:val="24"/>
+              </w:rPr>
+              <w:t xml:space="preserve"> 발생한 후보 이벤트를 감독관 검토용으로 임시 저장한다.</w:t>
+            </w:r>
+          </w:p>
+          <w:p>
+            <w:pPr>
+              <w:widowControl/>
+              <w:wordWrap/>
+              <w:autoSpaceDE/>
+              <w:autoSpaceDN/>
+              <w:spacing w:after="0" w:line="240" w:lineRule="auto"/>
+              <w:jc w:val="center"/>
+              <w:rPr>
+                <w:rFonts w:eastAsiaTheme="minorHAnsi" w:cs="굴림"/>
+                <w:kern w:val="0"/>
+                <w:sz w:val="24"/>
+                <w:szCs w:val="24"/>
+              </w:rPr>
+            </w:pPr>
+            <w:r>
+              <w:rPr>
+                <w:rFonts w:eastAsiaTheme="minorHAnsi" w:cs="굴림"/>
+                <w:kern w:val="0"/>
+                <w:sz w:val="24"/>
+                <w:szCs w:val="24"/>
+              </w:rPr>
+              <w:t xml:space="preserve">   이때 썸네일과 영상 클립은 검토용 임시 자료로만 활용한다.</w:t>
+            </w:r>
+            <w:r>
+              <w:rPr>
+                <w:rFonts w:eastAsiaTheme="minorHAnsi" w:cs="굴림"/>
+                <w:kern w:val="0"/>
+                <w:sz w:val="24"/>
+                <w:szCs w:val="24"/>
+              </w:rPr>
+              <w:t>.</w:t>
             </w:r>
           </w:p>
         </w:tc>
@@ -1090,7 +1150,7 @@
             </w:pPr>
             <w:r>
               <w:rPr>
-                <w:rFonts w:eastAsiaTheme="minorHAnsi" w:cs="굴림"/>
+                <w:rFonts w:eastAsiaTheme="minorHAnsi" w:cs="굴림" w:hint="eastAsia"/>
                 <w:kern w:val="0"/>
                 <w:sz w:val="24"/>
                 <w:szCs w:val="24"/>
@@ -1127,25 +1187,27 @@
                 <w:sz w:val="24"/>
                 <w:szCs w:val="24"/>
               </w:rPr>
-              <w:t xml:space="preserve">확정된 위반 데이터를 구역, 공정, PPE 종류, 시간대 기준으로 </w:t>
-            </w:r>
-            <w:r>
-              <w:rPr>
-                <w:rFonts w:eastAsiaTheme="minorHAnsi" w:cs="굴림"/>
-                <w:kern w:val="0"/>
-                <w:sz w:val="24"/>
-                <w:szCs w:val="24"/>
-              </w:rPr>
-              <w:br/>
-            </w:r>
-            <w:r>
-              <w:rPr>
-                <w:rFonts w:eastAsiaTheme="minorHAnsi" w:cs="굴림"/>
-                <w:kern w:val="0"/>
-                <w:sz w:val="24"/>
-                <w:szCs w:val="24"/>
-              </w:rPr>
-              <w:t>분기별 누적 저장한다.</w:t>
+              <w:t xml:space="preserve">담당자가 후보 이벤트를 검토하여 확정 위반, </w:t>
+            </w:r>
+            <w:proofErr w:type="spellStart"/>
+            <w:r>
+              <w:rPr>
+                <w:rFonts w:eastAsiaTheme="minorHAnsi" w:cs="굴림"/>
+                <w:kern w:val="0"/>
+                <w:sz w:val="24"/>
+                <w:szCs w:val="24"/>
+              </w:rPr>
+              <w:t>오탐</w:t>
+            </w:r>
+            <w:proofErr w:type="spellEnd"/>
+            <w:r>
+              <w:rPr>
+                <w:rFonts w:eastAsiaTheme="minorHAnsi" w:cs="굴림"/>
+                <w:kern w:val="0"/>
+                <w:sz w:val="24"/>
+                <w:szCs w:val="24"/>
+              </w:rPr>
+              <w:t>, 판단 보류로 분류한다.</w:t>
             </w:r>
           </w:p>
         </w:tc>
@@ -1158,26 +1220,25 @@
           <w:tcPr>
             <w:tcW w:w="0" w:type="auto"/>
             <w:vAlign w:val="center"/>
-            <w:hideMark/>
-          </w:tcPr>
-          <w:p>
-            <w:pPr>
-              <w:widowControl/>
-              <w:wordWrap/>
-              <w:autoSpaceDE/>
-              <w:autoSpaceDN/>
-              <w:spacing w:after="0" w:line="240" w:lineRule="auto"/>
-              <w:jc w:val="center"/>
-              <w:rPr>
-                <w:rFonts w:eastAsiaTheme="minorHAnsi" w:cs="굴림"/>
-                <w:kern w:val="0"/>
-                <w:sz w:val="24"/>
-                <w:szCs w:val="24"/>
-              </w:rPr>
-            </w:pPr>
-            <w:r>
-              <w:rPr>
-                <w:rFonts w:eastAsiaTheme="minorHAnsi" w:cs="굴림"/>
+          </w:tcPr>
+          <w:p>
+            <w:pPr>
+              <w:widowControl/>
+              <w:wordWrap/>
+              <w:autoSpaceDE/>
+              <w:autoSpaceDN/>
+              <w:spacing w:after="0" w:line="240" w:lineRule="auto"/>
+              <w:jc w:val="center"/>
+              <w:rPr>
+                <w:rFonts w:eastAsiaTheme="minorHAnsi" w:cs="굴림"/>
+                <w:kern w:val="0"/>
+                <w:sz w:val="24"/>
+                <w:szCs w:val="24"/>
+              </w:rPr>
+            </w:pPr>
+            <w:r>
+              <w:rPr>
+                <w:rFonts w:eastAsiaTheme="minorHAnsi" w:cs="굴림" w:hint="eastAsia"/>
                 <w:kern w:val="0"/>
                 <w:sz w:val="24"/>
                 <w:szCs w:val="24"/>
@@ -1190,31 +1251,41 @@
           <w:tcPr>
             <w:tcW w:w="0" w:type="auto"/>
             <w:vAlign w:val="center"/>
-            <w:hideMark/>
-          </w:tcPr>
-          <w:p>
-            <w:pPr>
-              <w:widowControl/>
-              <w:wordWrap/>
-              <w:autoSpaceDE/>
-              <w:autoSpaceDN/>
-              <w:spacing w:after="0" w:line="240" w:lineRule="auto"/>
-              <w:jc w:val="center"/>
-              <w:rPr>
-                <w:rFonts w:eastAsiaTheme="minorHAnsi" w:cs="굴림"/>
-                <w:kern w:val="0"/>
-                <w:sz w:val="24"/>
-                <w:szCs w:val="24"/>
-              </w:rPr>
-            </w:pPr>
-            <w:r>
-              <w:rPr>
-                <w:rFonts w:eastAsiaTheme="minorHAnsi" w:cs="굴림"/>
-                <w:kern w:val="0"/>
-                <w:sz w:val="24"/>
-                <w:szCs w:val="24"/>
-              </w:rPr>
-              <w:t xml:space="preserve">누적된 분기 데이터를 바탕으로 교육 우선순위를 산정하고 </w:t>
+          </w:tcPr>
+          <w:p>
+            <w:pPr>
+              <w:widowControl/>
+              <w:wordWrap/>
+              <w:autoSpaceDE/>
+              <w:autoSpaceDN/>
+              <w:spacing w:after="0" w:line="240" w:lineRule="auto"/>
+              <w:jc w:val="center"/>
+              <w:rPr>
+                <w:rFonts w:eastAsiaTheme="minorHAnsi" w:cs="굴림"/>
+                <w:kern w:val="0"/>
+                <w:sz w:val="24"/>
+                <w:szCs w:val="24"/>
+              </w:rPr>
+            </w:pPr>
+            <w:proofErr w:type="spellStart"/>
+            <w:r>
+              <w:rPr>
+                <w:rFonts w:eastAsiaTheme="minorHAnsi" w:cs="굴림" w:hint="eastAsia"/>
+                <w:kern w:val="0"/>
+                <w:sz w:val="24"/>
+                <w:szCs w:val="24"/>
+              </w:rPr>
+              <w:t>오탐으로</w:t>
+            </w:r>
+            <w:proofErr w:type="spellEnd"/>
+            <w:r>
+              <w:rPr>
+                <w:rFonts w:eastAsiaTheme="minorHAnsi" w:cs="굴림"/>
+                <w:kern w:val="0"/>
+                <w:sz w:val="24"/>
+                <w:szCs w:val="24"/>
+              </w:rPr>
+              <w:t xml:space="preserve"> 판단된 이벤트는 삭제한다. 확정 위반으로 판단된 이벤트는 </w:t>
             </w:r>
             <w:r>
               <w:rPr>
@@ -1232,7 +1303,221 @@
                 <w:sz w:val="24"/>
                 <w:szCs w:val="24"/>
               </w:rPr>
-              <w:t>추천 교육 주제를 도출한다.</w:t>
+              <w:t xml:space="preserve">원본 이미지와 영상을 삭제하고, </w:t>
+            </w:r>
+            <w:proofErr w:type="spellStart"/>
+            <w:r>
+              <w:rPr>
+                <w:rFonts w:eastAsiaTheme="minorHAnsi" w:cs="굴림"/>
+                <w:kern w:val="0"/>
+                <w:sz w:val="24"/>
+                <w:szCs w:val="24"/>
+              </w:rPr>
+              <w:t>비식별</w:t>
+            </w:r>
+            <w:proofErr w:type="spellEnd"/>
+            <w:r>
+              <w:rPr>
+                <w:rFonts w:eastAsiaTheme="minorHAnsi" w:cs="굴림"/>
+                <w:kern w:val="0"/>
+                <w:sz w:val="24"/>
+                <w:szCs w:val="24"/>
+              </w:rPr>
+              <w:t xml:space="preserve"> 이벤트 데이터만 저장한다.</w:t>
+            </w:r>
+          </w:p>
+        </w:tc>
+      </w:tr>
+      <w:tr>
+        <w:trPr>
+          <w:tblCellSpacing w:w="15" w:type="dxa"/>
+        </w:trPr>
+        <w:tc>
+          <w:tcPr>
+            <w:tcW w:w="0" w:type="auto"/>
+            <w:vAlign w:val="center"/>
+            <w:hideMark/>
+          </w:tcPr>
+          <w:p>
+            <w:pPr>
+              <w:widowControl/>
+              <w:wordWrap/>
+              <w:autoSpaceDE/>
+              <w:autoSpaceDN/>
+              <w:spacing w:after="0" w:line="240" w:lineRule="auto"/>
+              <w:jc w:val="center"/>
+              <w:rPr>
+                <w:rFonts w:eastAsiaTheme="minorHAnsi" w:cs="굴림"/>
+                <w:kern w:val="0"/>
+                <w:sz w:val="24"/>
+                <w:szCs w:val="24"/>
+              </w:rPr>
+            </w:pPr>
+            <w:r>
+              <w:rPr>
+                <w:rFonts w:eastAsiaTheme="minorHAnsi" w:cs="굴림" w:hint="eastAsia"/>
+                <w:kern w:val="0"/>
+                <w:sz w:val="24"/>
+                <w:szCs w:val="24"/>
+              </w:rPr>
+              <w:t>1</w:t>
+            </w:r>
+            <w:r>
+              <w:rPr>
+                <w:rFonts w:eastAsiaTheme="minorHAnsi" w:cs="굴림"/>
+                <w:kern w:val="0"/>
+                <w:sz w:val="24"/>
+                <w:szCs w:val="24"/>
+              </w:rPr>
+              <w:t>0</w:t>
+            </w:r>
+          </w:p>
+        </w:tc>
+        <w:tc>
+          <w:tcPr>
+            <w:tcW w:w="0" w:type="auto"/>
+            <w:vAlign w:val="center"/>
+            <w:hideMark/>
+          </w:tcPr>
+          <w:p>
+            <w:pPr>
+              <w:widowControl/>
+              <w:wordWrap/>
+              <w:autoSpaceDE/>
+              <w:autoSpaceDN/>
+              <w:spacing w:after="0" w:line="240" w:lineRule="auto"/>
+              <w:jc w:val="center"/>
+              <w:rPr>
+                <w:rFonts w:eastAsiaTheme="minorHAnsi" w:cs="굴림"/>
+                <w:kern w:val="0"/>
+                <w:sz w:val="24"/>
+                <w:szCs w:val="24"/>
+              </w:rPr>
+            </w:pPr>
+            <w:proofErr w:type="spellStart"/>
+            <w:r>
+              <w:rPr>
+                <w:rFonts w:eastAsiaTheme="minorHAnsi" w:cs="굴림" w:hint="eastAsia"/>
+                <w:kern w:val="0"/>
+                <w:sz w:val="24"/>
+                <w:szCs w:val="24"/>
+              </w:rPr>
+              <w:t>비식별</w:t>
+            </w:r>
+            <w:proofErr w:type="spellEnd"/>
+            <w:r>
+              <w:rPr>
+                <w:rFonts w:eastAsiaTheme="minorHAnsi" w:cs="굴림"/>
+                <w:kern w:val="0"/>
+                <w:sz w:val="24"/>
+                <w:szCs w:val="24"/>
+              </w:rPr>
+              <w:t xml:space="preserve"> 확정 위반 데이터를 구역, 공정, PPE 종류, 시간대 기준으로 </w:t>
+            </w:r>
+            <w:r>
+              <w:rPr>
+                <w:rFonts w:eastAsiaTheme="minorHAnsi" w:cs="굴림"/>
+                <w:kern w:val="0"/>
+                <w:sz w:val="24"/>
+                <w:szCs w:val="24"/>
+              </w:rPr>
+              <w:br/>
+            </w:r>
+            <w:r>
+              <w:rPr>
+                <w:rFonts w:eastAsiaTheme="minorHAnsi" w:cs="굴림"/>
+                <w:kern w:val="0"/>
+                <w:sz w:val="24"/>
+                <w:szCs w:val="24"/>
+              </w:rPr>
+              <w:t>분기별 누적 저장한다.</w:t>
+            </w:r>
+          </w:p>
+        </w:tc>
+      </w:tr>
+      <w:tr>
+        <w:trPr>
+          <w:tblCellSpacing w:w="15" w:type="dxa"/>
+        </w:trPr>
+        <w:tc>
+          <w:tcPr>
+            <w:tcW w:w="0" w:type="auto"/>
+            <w:vAlign w:val="center"/>
+            <w:hideMark/>
+          </w:tcPr>
+          <w:p>
+            <w:pPr>
+              <w:widowControl/>
+              <w:wordWrap/>
+              <w:autoSpaceDE/>
+              <w:autoSpaceDN/>
+              <w:spacing w:after="0" w:line="240" w:lineRule="auto"/>
+              <w:jc w:val="center"/>
+              <w:rPr>
+                <w:rFonts w:eastAsiaTheme="minorHAnsi" w:cs="굴림"/>
+                <w:kern w:val="0"/>
+                <w:sz w:val="24"/>
+                <w:szCs w:val="24"/>
+              </w:rPr>
+            </w:pPr>
+            <w:r>
+              <w:rPr>
+                <w:rFonts w:eastAsiaTheme="minorHAnsi" w:cs="굴림" w:hint="eastAsia"/>
+                <w:kern w:val="0"/>
+                <w:sz w:val="24"/>
+                <w:szCs w:val="24"/>
+              </w:rPr>
+              <w:t>1</w:t>
+            </w:r>
+            <w:r>
+              <w:rPr>
+                <w:rFonts w:eastAsiaTheme="minorHAnsi" w:cs="굴림"/>
+                <w:kern w:val="0"/>
+                <w:sz w:val="24"/>
+                <w:szCs w:val="24"/>
+              </w:rPr>
+              <w:t>1</w:t>
+            </w:r>
+          </w:p>
+        </w:tc>
+        <w:tc>
+          <w:tcPr>
+            <w:tcW w:w="0" w:type="auto"/>
+            <w:vAlign w:val="center"/>
+            <w:hideMark/>
+          </w:tcPr>
+          <w:p>
+            <w:pPr>
+              <w:widowControl/>
+              <w:wordWrap/>
+              <w:autoSpaceDE/>
+              <w:autoSpaceDN/>
+              <w:spacing w:after="0" w:line="240" w:lineRule="auto"/>
+              <w:jc w:val="center"/>
+              <w:rPr>
+                <w:rFonts w:eastAsiaTheme="minorHAnsi" w:cs="굴림"/>
+                <w:kern w:val="0"/>
+                <w:sz w:val="24"/>
+                <w:szCs w:val="24"/>
+              </w:rPr>
+            </w:pPr>
+            <w:r>
+              <w:rPr>
+                <w:rFonts w:eastAsiaTheme="minorHAnsi" w:cs="굴림" w:hint="eastAsia"/>
+                <w:kern w:val="0"/>
+                <w:sz w:val="24"/>
+                <w:szCs w:val="24"/>
+              </w:rPr>
+              <w:t>누적된</w:t>
+            </w:r>
+            <w:r>
+              <w:rPr>
+                <w:rFonts w:eastAsiaTheme="minorHAnsi" w:cs="굴림"/>
+                <w:kern w:val="0"/>
+                <w:sz w:val="24"/>
+                <w:szCs w:val="24"/>
+              </w:rPr>
+              <w:t xml:space="preserve"> 분기 데이터를 바탕으로 교육 우선순위를 산정하고 추천 교육 주제를 도출한다.</w:t>
             </w:r>
           </w:p>
         </w:tc>
@@ -1311,7 +1596,7 @@
     <w:p>
       <w:pPr>
         <w:rPr>
-          <w:rFonts w:eastAsiaTheme="minorHAnsi" w:hint="eastAsia"/>
+          <w:rFonts w:eastAsiaTheme="minorHAnsi"/>
         </w:rPr>
       </w:pPr>
     </w:p>
@@ -1330,7 +1615,6 @@
           <w:sz w:val="28"/>
           <w:szCs w:val="28"/>
         </w:rPr>
-        <w:lastRenderedPageBreak/>
         <w:t>1-2. 공정/구역별 필수 PPE 기준표</w:t>
       </w:r>
     </w:p>
@@ -2371,20 +2655,13 @@
         <w:rPr>
           <w:rFonts w:asciiTheme="minorHAnsi" w:eastAsiaTheme="minorHAnsi" w:hAnsiTheme="minorHAnsi"/>
         </w:rPr>
-        <w:t xml:space="preserve">금속/기계 제조 공장 환경에서는 작업자가 땀을 닦거나 머리를 긁는 동작, 순간적인 가림, 상체 회전, 설비 뒤 가림 등으로 인해 PPE가 잠시 보이지 않을 수 있다. 따라서 단일 프레임에서 바로 위반으로 처리하지 않고, </w:t>
-      </w:r>
-      <w:r>
-        <w:rPr>
-          <w:rStyle w:val="a4"/>
+        <w:t xml:space="preserve">금속/기계 제조 공장 환경에서는 작업자가 땀을 닦거나 머리를 긁는 동작, 순간적인 가림, 상체 회전, 설비 뒤 가림 등으로 인해 PPE가 잠시 보이지 않을 수 있다. 따라서 </w:t>
+      </w:r>
+      <w:r>
+        <w:rPr>
           <w:rFonts w:asciiTheme="minorHAnsi" w:eastAsiaTheme="minorHAnsi" w:hAnsiTheme="minorHAnsi"/>
         </w:rPr>
-        <w:t>일정 시간 이상 지속될 때만 후보 이벤트를 생성</w:t>
-      </w:r>
-      <w:r>
-        <w:rPr>
-          <w:rFonts w:asciiTheme="minorHAnsi" w:eastAsiaTheme="minorHAnsi" w:hAnsiTheme="minorHAnsi"/>
-        </w:rPr>
-        <w:t>한다.</w:t>
+        <w:t>PPE 미착용 의심 상태가 기준 시간 이상 지속되면 시스템은 후보 이벤트를 생성하고, 동시에 현장에 중립적 경고 방송을 송출한다. 경고 방송은 특정 작업자를 지목하지 않고, PPE 착용을 안내하는 방식으로 구성한다.</w:t>
       </w:r>
     </w:p>
     <w:tbl>
@@ -2781,6 +3058,15 @@
       </w:pPr>
       <w:r>
         <w:rPr>
+          <w:rFonts w:eastAsiaTheme="minorHAnsi" w:hint="eastAsia"/>
+          <w:sz w:val="24"/>
+          <w:szCs w:val="24"/>
+        </w:rPr>
+        <w:lastRenderedPageBreak/>
+        <w:t xml:space="preserve">생성 시간은 </w:t>
+      </w:r>
+      <w:r>
+        <w:rPr>
           <w:rFonts w:eastAsiaTheme="minorHAnsi"/>
           <w:sz w:val="24"/>
           <w:szCs w:val="24"/>
@@ -2855,7 +3141,6 @@
           <w:sz w:val="28"/>
           <w:szCs w:val="28"/>
         </w:rPr>
-        <w:lastRenderedPageBreak/>
         <w:t>1-4. 후보 이벤트 병합 및 중복 제거 기준</w:t>
       </w:r>
     </w:p>
@@ -2891,8 +3176,8 @@
         <w:tblLook w:val="04A0" w:firstRow="1" w:lastRow="0" w:firstColumn="1" w:lastColumn="0" w:noHBand="0" w:noVBand="1"/>
       </w:tblPr>
       <w:tblGrid>
-        <w:gridCol w:w="1587"/>
-        <w:gridCol w:w="7439"/>
+        <w:gridCol w:w="1204"/>
+        <w:gridCol w:w="7822"/>
       </w:tblGrid>
       <w:tr>
         <w:trPr>
@@ -3173,12 +3458,39 @@
             </w:pPr>
             <w:r>
               <w:rPr>
-                <w:rFonts w:eastAsiaTheme="minorHAnsi" w:cs="굴림"/>
-                <w:kern w:val="0"/>
-                <w:sz w:val="24"/>
-                <w:szCs w:val="24"/>
-              </w:rPr>
-              <w:t>하나의 이벤트당 대표 썸네일 1장, 짧은 클립 1개를 저장한다.</w:t>
+                <w:rFonts w:eastAsiaTheme="minorHAnsi" w:cs="굴림" w:hint="eastAsia"/>
+                <w:kern w:val="0"/>
+                <w:sz w:val="24"/>
+                <w:szCs w:val="24"/>
+              </w:rPr>
+              <w:t>하나의</w:t>
+            </w:r>
+            <w:r>
+              <w:rPr>
+                <w:rFonts w:eastAsiaTheme="minorHAnsi" w:cs="굴림"/>
+                <w:kern w:val="0"/>
+                <w:sz w:val="24"/>
+                <w:szCs w:val="24"/>
+              </w:rPr>
+              <w:t xml:space="preserve"> 이벤트당 감독관 검토를 위한 임시 썸네일 또는 짧은 참조 클립을 생성할 수 있다. 단, 해당 미디어는 검토용 임시 자료로만 사용하며, </w:t>
+            </w:r>
+            <w:r>
+              <w:rPr>
+                <w:rFonts w:eastAsiaTheme="minorHAnsi" w:cs="굴림"/>
+                <w:kern w:val="0"/>
+                <w:sz w:val="24"/>
+                <w:szCs w:val="24"/>
+              </w:rPr>
+              <w:t>담당자</w:t>
+            </w:r>
+            <w:r>
+              <w:rPr>
+                <w:rFonts w:eastAsiaTheme="minorHAnsi" w:cs="굴림"/>
+                <w:kern w:val="0"/>
+                <w:sz w:val="24"/>
+                <w:szCs w:val="24"/>
+              </w:rPr>
+              <w:t xml:space="preserve"> 검토 후 원본 이미지와 영상은 삭제한다.</w:t>
             </w:r>
           </w:p>
         </w:tc>
@@ -3258,6 +3570,105 @@
       <w:pPr>
         <w:rPr>
           <w:rFonts w:eastAsiaTheme="minorHAnsi"/>
+          <w:sz w:val="24"/>
+          <w:szCs w:val="24"/>
+        </w:rPr>
+      </w:pPr>
+      <w:r>
+        <w:rPr>
+          <w:rFonts w:eastAsiaTheme="minorHAnsi" w:hint="eastAsia"/>
+          <w:sz w:val="24"/>
+          <w:szCs w:val="24"/>
+        </w:rPr>
+        <w:t>검토</w:t>
+      </w:r>
+      <w:r>
+        <w:rPr>
+          <w:rFonts w:eastAsiaTheme="minorHAnsi"/>
+          <w:sz w:val="24"/>
+          <w:szCs w:val="24"/>
+        </w:rPr>
+        <w:t xml:space="preserve"> 결과 </w:t>
+      </w:r>
+      <w:proofErr w:type="spellStart"/>
+      <w:r>
+        <w:rPr>
+          <w:rFonts w:eastAsiaTheme="minorHAnsi"/>
+          <w:sz w:val="24"/>
+          <w:szCs w:val="24"/>
+        </w:rPr>
+        <w:t>오탐으로</w:t>
+      </w:r>
+      <w:proofErr w:type="spellEnd"/>
+      <w:r>
+        <w:rPr>
+          <w:rFonts w:eastAsiaTheme="minorHAnsi"/>
+          <w:sz w:val="24"/>
+          <w:szCs w:val="24"/>
+        </w:rPr>
+        <w:t xml:space="preserve"> 판단된 이벤트는 삭제한다. 확정 위반으로 판단된 이벤트는 원본 이미지와 영상은 삭제하고, 구역, 공정, PPE 유형, 발생 시각, 검토 결과 등 </w:t>
+      </w:r>
+      <w:proofErr w:type="spellStart"/>
+      <w:r>
+        <w:rPr>
+          <w:rFonts w:eastAsiaTheme="minorHAnsi"/>
+          <w:sz w:val="24"/>
+          <w:szCs w:val="24"/>
+        </w:rPr>
+        <w:t>비식별</w:t>
+      </w:r>
+      <w:proofErr w:type="spellEnd"/>
+      <w:r>
+        <w:rPr>
+          <w:rFonts w:eastAsiaTheme="minorHAnsi"/>
+          <w:sz w:val="24"/>
+          <w:szCs w:val="24"/>
+        </w:rPr>
+        <w:t xml:space="preserve"> 이벤트 데이터만 분기 통계에 반영한다.</w:t>
+      </w:r>
+    </w:p>
+    <w:p>
+      <w:pPr>
+        <w:rPr>
+          <w:rFonts w:eastAsiaTheme="minorHAnsi"/>
+          <w:sz w:val="24"/>
+          <w:szCs w:val="24"/>
+        </w:rPr>
+      </w:pPr>
+    </w:p>
+    <w:p>
+      <w:pPr>
+        <w:rPr>
+          <w:rFonts w:eastAsiaTheme="minorHAnsi"/>
+          <w:sz w:val="24"/>
+          <w:szCs w:val="24"/>
+        </w:rPr>
+      </w:pPr>
+    </w:p>
+    <w:p>
+      <w:pPr>
+        <w:rPr>
+          <w:rFonts w:eastAsiaTheme="minorHAnsi"/>
+          <w:sz w:val="24"/>
+          <w:szCs w:val="24"/>
+        </w:rPr>
+      </w:pPr>
+    </w:p>
+    <w:p>
+      <w:pPr>
+        <w:rPr>
+          <w:rFonts w:eastAsiaTheme="minorHAnsi"/>
+          <w:sz w:val="24"/>
+          <w:szCs w:val="24"/>
+        </w:rPr>
+      </w:pPr>
+    </w:p>
+    <w:p>
+      <w:pPr>
+        <w:rPr>
+          <w:rFonts w:eastAsiaTheme="minorHAnsi"/>
+          <w:sz w:val="24"/>
+          <w:szCs w:val="24"/>
         </w:rPr>
       </w:pPr>
     </w:p>
@@ -3276,6 +3687,7 @@
           <w:sz w:val="28"/>
           <w:szCs w:val="28"/>
         </w:rPr>
+        <w:lastRenderedPageBreak/>
         <w:t>1-5. 초기 MVP 범위</w:t>
       </w:r>
     </w:p>
@@ -4112,6 +4524,83 @@
     </w:p>
     <w:p>
       <w:pPr>
+        <w:rPr>
+          <w:rFonts w:eastAsiaTheme="minorHAnsi"/>
+        </w:rPr>
+      </w:pPr>
+    </w:p>
+    <w:p>
+      <w:pPr>
+        <w:rPr>
+          <w:rFonts w:eastAsiaTheme="minorHAnsi"/>
+        </w:rPr>
+      </w:pPr>
+    </w:p>
+    <w:p>
+      <w:pPr>
+        <w:rPr>
+          <w:rFonts w:eastAsiaTheme="minorHAnsi"/>
+        </w:rPr>
+      </w:pPr>
+    </w:p>
+    <w:p>
+      <w:pPr>
+        <w:rPr>
+          <w:rFonts w:eastAsiaTheme="minorHAnsi"/>
+        </w:rPr>
+      </w:pPr>
+    </w:p>
+    <w:p>
+      <w:pPr>
+        <w:rPr>
+          <w:rFonts w:eastAsiaTheme="minorHAnsi"/>
+        </w:rPr>
+      </w:pPr>
+    </w:p>
+    <w:p>
+      <w:pPr>
+        <w:rPr>
+          <w:rFonts w:eastAsiaTheme="minorHAnsi"/>
+        </w:rPr>
+      </w:pPr>
+    </w:p>
+    <w:p>
+      <w:pPr>
+        <w:rPr>
+          <w:rFonts w:eastAsiaTheme="minorHAnsi"/>
+        </w:rPr>
+      </w:pPr>
+    </w:p>
+    <w:p>
+      <w:pPr>
+        <w:rPr>
+          <w:rFonts w:eastAsiaTheme="minorHAnsi"/>
+        </w:rPr>
+      </w:pPr>
+    </w:p>
+    <w:p>
+      <w:pPr>
+        <w:rPr>
+          <w:rFonts w:eastAsiaTheme="minorHAnsi"/>
+        </w:rPr>
+      </w:pPr>
+    </w:p>
+    <w:p>
+      <w:pPr>
+        <w:rPr>
+          <w:rFonts w:eastAsiaTheme="minorHAnsi"/>
+        </w:rPr>
+      </w:pPr>
+    </w:p>
+    <w:p>
+      <w:pPr>
+        <w:rPr>
+          <w:rFonts w:eastAsiaTheme="minorHAnsi"/>
+        </w:rPr>
+      </w:pPr>
+    </w:p>
+    <w:p>
+      <w:pPr>
         <w:pStyle w:val="1"/>
         <w:rPr>
           <w:rFonts w:asciiTheme="minorHAnsi" w:eastAsiaTheme="minorHAnsi" w:hAnsiTheme="minorHAnsi"/>
@@ -4144,6 +4633,8 @@
         <w:pStyle w:val="a3"/>
         <w:rPr>
           <w:rFonts w:asciiTheme="minorHAnsi" w:eastAsiaTheme="minorHAnsi" w:hAnsiTheme="minorHAnsi"/>
+          <w:sz w:val="20"/>
+          <w:szCs w:val="20"/>
         </w:rPr>
       </w:pPr>
       <w:r>
@@ -4179,14 +4670,6 @@
         </w:rPr>
         <w:t xml:space="preserve">을 강조하고 있으며, 실제 감시 카메라와 유사한 조건을 반영한 데이터가 중요하다고 본다. </w:t>
       </w:r>
-    </w:p>
-    <w:p>
-      <w:pPr>
-        <w:pStyle w:val="a3"/>
-        <w:rPr>
-          <w:rFonts w:asciiTheme="minorHAnsi" w:eastAsiaTheme="minorHAnsi" w:hAnsiTheme="minorHAnsi"/>
-        </w:rPr>
-      </w:pPr>
     </w:p>
     <w:p>
       <w:pPr>
@@ -5601,7 +6084,6 @@
                 <w:sz w:val="24"/>
                 <w:szCs w:val="24"/>
               </w:rPr>
-              <w:lastRenderedPageBreak/>
               <w:t>vest</w:t>
             </w:r>
           </w:p>
@@ -5736,13 +6218,6 @@
       <w:pPr>
         <w:rPr>
           <w:rFonts w:eastAsiaTheme="minorHAnsi"/>
-        </w:rPr>
-      </w:pPr>
-    </w:p>
-    <w:p>
-      <w:pPr>
-        <w:rPr>
-          <w:rFonts w:eastAsiaTheme="minorHAnsi"/>
           <w:sz w:val="28"/>
           <w:szCs w:val="28"/>
         </w:rPr>
@@ -5753,6 +6228,7 @@
           <w:sz w:val="28"/>
           <w:szCs w:val="28"/>
         </w:rPr>
+        <w:lastRenderedPageBreak/>
         <w:t xml:space="preserve">2-3. </w:t>
       </w:r>
       <w:proofErr w:type="spellStart"/>
@@ -6710,27 +7186,6 @@
       <w:pPr>
         <w:rPr>
           <w:rFonts w:eastAsiaTheme="minorHAnsi"/>
-        </w:rPr>
-      </w:pPr>
-    </w:p>
-    <w:p>
-      <w:pPr>
-        <w:rPr>
-          <w:rFonts w:eastAsiaTheme="minorHAnsi"/>
-        </w:rPr>
-      </w:pPr>
-    </w:p>
-    <w:p>
-      <w:pPr>
-        <w:rPr>
-          <w:rFonts w:eastAsiaTheme="minorHAnsi" w:hint="eastAsia"/>
-        </w:rPr>
-      </w:pPr>
-    </w:p>
-    <w:p>
-      <w:pPr>
-        <w:rPr>
-          <w:rFonts w:eastAsiaTheme="minorHAnsi"/>
           <w:sz w:val="28"/>
           <w:szCs w:val="28"/>
         </w:rPr>
@@ -6741,7 +7196,6 @@
           <w:sz w:val="28"/>
           <w:szCs w:val="28"/>
         </w:rPr>
-        <w:lastRenderedPageBreak/>
         <w:t>2-5. 착용 여부 판정에 활용할 관계 기준</w:t>
       </w:r>
     </w:p>
@@ -7078,6 +7532,7 @@
           <w:sz w:val="28"/>
           <w:szCs w:val="28"/>
         </w:rPr>
+        <w:lastRenderedPageBreak/>
         <w:t xml:space="preserve">2-6. </w:t>
       </w:r>
       <w:proofErr w:type="spellStart"/>
@@ -8137,6 +8592,41 @@
     </w:p>
     <w:p>
       <w:pPr>
+        <w:rPr>
+          <w:rFonts w:eastAsiaTheme="minorHAnsi"/>
+        </w:rPr>
+      </w:pPr>
+    </w:p>
+    <w:p>
+      <w:pPr>
+        <w:rPr>
+          <w:rFonts w:eastAsiaTheme="minorHAnsi"/>
+        </w:rPr>
+      </w:pPr>
+    </w:p>
+    <w:p>
+      <w:pPr>
+        <w:rPr>
+          <w:rFonts w:eastAsiaTheme="minorHAnsi"/>
+        </w:rPr>
+      </w:pPr>
+    </w:p>
+    <w:p>
+      <w:pPr>
+        <w:rPr>
+          <w:rFonts w:eastAsiaTheme="minorHAnsi"/>
+        </w:rPr>
+      </w:pPr>
+    </w:p>
+    <w:p>
+      <w:pPr>
+        <w:rPr>
+          <w:rFonts w:eastAsiaTheme="minorHAnsi"/>
+        </w:rPr>
+      </w:pPr>
+    </w:p>
+    <w:p>
+      <w:pPr>
         <w:pStyle w:val="2"/>
         <w:rPr>
           <w:rFonts w:asciiTheme="minorHAnsi" w:eastAsiaTheme="minorHAnsi" w:hAnsiTheme="minorHAnsi"/>
@@ -8689,7 +9179,7 @@
     <w:p>
       <w:pPr>
         <w:rPr>
-          <w:rFonts w:eastAsiaTheme="minorHAnsi" w:hint="eastAsia"/>
+          <w:rFonts w:eastAsiaTheme="minorHAnsi"/>
         </w:rPr>
       </w:pPr>
     </w:p>
@@ -8740,20 +9230,39 @@
         <w:rPr>
           <w:rFonts w:asciiTheme="minorHAnsi" w:eastAsiaTheme="minorHAnsi" w:hAnsiTheme="minorHAnsi"/>
         </w:rPr>
-        <w:t xml:space="preserve">본 프로젝트의 DB 구조는 AI 탐지 결과를 단순 저장하는 목적이 아니라, </w:t>
-      </w:r>
-      <w:r>
-        <w:rPr>
-          <w:rStyle w:val="a4"/>
+        <w:t xml:space="preserve">본 프로젝트의 </w:t>
+      </w:r>
+      <w:r>
+        <w:rPr>
           <w:rFonts w:asciiTheme="minorHAnsi" w:eastAsiaTheme="minorHAnsi" w:hAnsiTheme="minorHAnsi"/>
         </w:rPr>
-        <w:t>후보 이벤트 생성, 담당자 검토, 분기별 통계 누적, 교육 추천</w:t>
+        <w:t xml:space="preserve">DB 구조는 원본 이미지나 영상을 장기 보관하지 않고, PPE 미착용 의심 이벤트와 </w:t>
       </w:r>
       <w:r>
         <w:rPr>
           <w:rFonts w:asciiTheme="minorHAnsi" w:eastAsiaTheme="minorHAnsi" w:hAnsiTheme="minorHAnsi"/>
         </w:rPr>
-        <w:t>까지 이어지는 전체 분석 흐름을 지원하도록 설계하였다.</w:t>
+        <w:t>담당자</w:t>
+      </w:r>
+      <w:r>
+        <w:rPr>
+          <w:rFonts w:asciiTheme="minorHAnsi" w:eastAsiaTheme="minorHAnsi" w:hAnsiTheme="minorHAnsi"/>
+        </w:rPr>
+        <w:t xml:space="preserve"> 검토 결과를 관리하는 데 초점을 둔다. 검토 과정에서 필요한 썸네일과 짧은 영상 클립은 임시 참조용으로만 사용하며, 검토 완료 후 원본 미디어는 삭제한다. 분기별 통계와 교육 추천에는 </w:t>
+      </w:r>
+      <w:proofErr w:type="spellStart"/>
+      <w:r>
+        <w:rPr>
+          <w:rFonts w:asciiTheme="minorHAnsi" w:eastAsiaTheme="minorHAnsi" w:hAnsiTheme="minorHAnsi"/>
+        </w:rPr>
+        <w:t>비식별화된</w:t>
+      </w:r>
+      <w:proofErr w:type="spellEnd"/>
+      <w:r>
+        <w:rPr>
+          <w:rFonts w:asciiTheme="minorHAnsi" w:eastAsiaTheme="minorHAnsi" w:hAnsiTheme="minorHAnsi"/>
+        </w:rPr>
+        <w:t xml:space="preserve"> 확정 위반 데이터만 활용한다.</w:t>
       </w:r>
     </w:p>
     <w:p>
@@ -10229,20 +10738,6 @@
     </w:p>
     <w:p>
       <w:pPr>
-        <w:rPr>
-          <w:rFonts w:eastAsiaTheme="minorHAnsi"/>
-        </w:rPr>
-      </w:pPr>
-    </w:p>
-    <w:p>
-      <w:pPr>
-        <w:rPr>
-          <w:rFonts w:eastAsiaTheme="minorHAnsi"/>
-        </w:rPr>
-      </w:pPr>
-    </w:p>
-    <w:p>
-      <w:pPr>
         <w:pStyle w:val="2"/>
         <w:rPr>
           <w:rFonts w:asciiTheme="minorHAnsi" w:eastAsiaTheme="minorHAnsi" w:hAnsiTheme="minorHAnsi"/>
@@ -11402,14 +11897,25 @@
             </w:pPr>
             <w:r>
               <w:rPr>
-                <w:rFonts w:eastAsiaTheme="minorHAnsi" w:cs="굴림"/>
-                <w:b/>
-                <w:bCs/>
-                <w:kern w:val="0"/>
-                <w:sz w:val="24"/>
-                <w:szCs w:val="24"/>
-              </w:rPr>
-              <w:t>대표 이미지 저장 경로</w:t>
+                <w:rFonts w:eastAsiaTheme="minorHAnsi" w:cs="굴림" w:hint="eastAsia"/>
+                <w:b/>
+                <w:bCs/>
+                <w:kern w:val="0"/>
+                <w:sz w:val="24"/>
+                <w:szCs w:val="24"/>
+              </w:rPr>
+              <w:t>검토용</w:t>
+            </w:r>
+            <w:r>
+              <w:rPr>
+                <w:rFonts w:eastAsiaTheme="minorHAnsi" w:cs="굴림"/>
+                <w:b/>
+                <w:bCs/>
+                <w:kern w:val="0"/>
+                <w:sz w:val="24"/>
+                <w:szCs w:val="24"/>
+              </w:rPr>
+              <w:t xml:space="preserve"> 대표 이미지 임시 경로</w:t>
             </w:r>
           </w:p>
         </w:tc>
@@ -11517,14 +12023,25 @@
             </w:pPr>
             <w:r>
               <w:rPr>
-                <w:rFonts w:eastAsiaTheme="minorHAnsi" w:cs="굴림"/>
-                <w:b/>
-                <w:bCs/>
-                <w:kern w:val="0"/>
-                <w:sz w:val="24"/>
-                <w:szCs w:val="24"/>
-              </w:rPr>
-              <w:t>이벤트 영상 클립 경로</w:t>
+                <w:rFonts w:eastAsiaTheme="minorHAnsi" w:cs="굴림" w:hint="eastAsia"/>
+                <w:b/>
+                <w:bCs/>
+                <w:kern w:val="0"/>
+                <w:sz w:val="24"/>
+                <w:szCs w:val="24"/>
+              </w:rPr>
+              <w:t>검토용</w:t>
+            </w:r>
+            <w:r>
+              <w:rPr>
+                <w:rFonts w:eastAsiaTheme="minorHAnsi" w:cs="굴림"/>
+                <w:b/>
+                <w:bCs/>
+                <w:kern w:val="0"/>
+                <w:sz w:val="24"/>
+                <w:szCs w:val="24"/>
+              </w:rPr>
+              <w:t xml:space="preserve"> 짧은 클립 임시 경로</w:t>
             </w:r>
           </w:p>
         </w:tc>
@@ -12092,14 +12609,25 @@
             </w:pPr>
             <w:r>
               <w:rPr>
-                <w:rFonts w:eastAsiaTheme="minorHAnsi" w:cs="굴림"/>
-                <w:b/>
-                <w:bCs/>
-                <w:kern w:val="0"/>
-                <w:sz w:val="24"/>
-                <w:szCs w:val="24"/>
-              </w:rPr>
-              <w:t>이벤트 처리 상태</w:t>
+                <w:rFonts w:eastAsiaTheme="minorHAnsi" w:cs="굴림" w:hint="eastAsia"/>
+                <w:b/>
+                <w:bCs/>
+                <w:kern w:val="0"/>
+                <w:sz w:val="24"/>
+                <w:szCs w:val="24"/>
+              </w:rPr>
+              <w:t>후보</w:t>
+            </w:r>
+            <w:r>
+              <w:rPr>
+                <w:rFonts w:eastAsiaTheme="minorHAnsi" w:cs="굴림"/>
+                <w:b/>
+                <w:bCs/>
+                <w:kern w:val="0"/>
+                <w:sz w:val="24"/>
+                <w:szCs w:val="24"/>
+              </w:rPr>
+              <w:t xml:space="preserve"> 이벤트 처리 상태</w:t>
             </w:r>
           </w:p>
         </w:tc>
@@ -12145,6 +12673,316 @@
       <w:pPr>
         <w:rPr>
           <w:rFonts w:eastAsiaTheme="minorHAnsi"/>
+          <w:sz w:val="22"/>
+        </w:rPr>
+      </w:pPr>
+      <w:r>
+        <w:rPr>
+          <w:rFonts w:eastAsiaTheme="minorHAnsi"/>
+          <w:sz w:val="22"/>
+        </w:rPr>
+        <w:t>`</w:t>
+      </w:r>
+      <w:proofErr w:type="spellStart"/>
+      <w:r>
+        <w:rPr>
+          <w:rFonts w:eastAsiaTheme="minorHAnsi"/>
+          <w:sz w:val="22"/>
+        </w:rPr>
+        <w:t>thumbnail_path</w:t>
+      </w:r>
+      <w:proofErr w:type="spellEnd"/>
+      <w:r>
+        <w:rPr>
+          <w:rFonts w:eastAsiaTheme="minorHAnsi"/>
+          <w:sz w:val="22"/>
+        </w:rPr>
+        <w:t>`와 `</w:t>
+      </w:r>
+      <w:proofErr w:type="spellStart"/>
+      <w:r>
+        <w:rPr>
+          <w:rFonts w:eastAsiaTheme="minorHAnsi"/>
+          <w:sz w:val="22"/>
+        </w:rPr>
+        <w:t>video_clip_path</w:t>
+      </w:r>
+      <w:proofErr w:type="spellEnd"/>
+      <w:r>
+        <w:rPr>
+          <w:rFonts w:eastAsiaTheme="minorHAnsi"/>
+          <w:sz w:val="22"/>
+        </w:rPr>
+        <w:t xml:space="preserve">`는 </w:t>
+      </w:r>
+      <w:r>
+        <w:rPr>
+          <w:rFonts w:eastAsiaTheme="minorHAnsi"/>
+          <w:sz w:val="22"/>
+        </w:rPr>
+        <w:t>담당자</w:t>
+      </w:r>
+      <w:r>
+        <w:rPr>
+          <w:rFonts w:eastAsiaTheme="minorHAnsi"/>
+          <w:sz w:val="22"/>
+        </w:rPr>
+        <w:t xml:space="preserve"> 검토를 위한 임시 참조 정보로 사용한다. 해당 이미지와 영상은 장기 보관 대상이 아니며, </w:t>
+      </w:r>
+      <w:r>
+        <w:rPr>
+          <w:rFonts w:eastAsiaTheme="minorHAnsi"/>
+          <w:sz w:val="22"/>
+        </w:rPr>
+        <w:t>담당자</w:t>
+      </w:r>
+      <w:r>
+        <w:rPr>
+          <w:rFonts w:eastAsiaTheme="minorHAnsi"/>
+          <w:sz w:val="22"/>
+        </w:rPr>
+        <w:t xml:space="preserve"> 검토 완료 후 삭제한다.</w:t>
+      </w:r>
+    </w:p>
+    <w:p>
+      <w:pPr>
+        <w:rPr>
+          <w:rFonts w:eastAsiaTheme="minorHAnsi"/>
+          <w:sz w:val="22"/>
+        </w:rPr>
+      </w:pPr>
+      <w:r>
+        <w:rPr>
+          <w:rFonts w:eastAsiaTheme="minorHAnsi"/>
+          <w:sz w:val="22"/>
+        </w:rPr>
+        <w:t>`</w:t>
+      </w:r>
+      <w:proofErr w:type="spellStart"/>
+      <w:r>
+        <w:rPr>
+          <w:rFonts w:eastAsiaTheme="minorHAnsi"/>
+          <w:sz w:val="22"/>
+        </w:rPr>
+        <w:t>event_status</w:t>
+      </w:r>
+      <w:proofErr w:type="spellEnd"/>
+      <w:r>
+        <w:rPr>
+          <w:rFonts w:eastAsiaTheme="minorHAnsi"/>
+          <w:sz w:val="22"/>
+        </w:rPr>
+        <w:t xml:space="preserve">`는 후보 이벤트의 처리 상태를 나타낸다. 검토 전에는 `pending`으로 저장하며, </w:t>
+      </w:r>
+      <w:r>
+        <w:rPr>
+          <w:rFonts w:eastAsiaTheme="minorHAnsi"/>
+          <w:sz w:val="22"/>
+        </w:rPr>
+        <w:t>담당자</w:t>
+      </w:r>
+      <w:r>
+        <w:rPr>
+          <w:rFonts w:eastAsiaTheme="minorHAnsi"/>
+          <w:sz w:val="22"/>
+        </w:rPr>
+        <w:t xml:space="preserve"> 검토 결과에 따라 확정 위반은 `confirmed`, 판단 보류는 `hold`로 </w:t>
+      </w:r>
+      <w:r>
+        <w:rPr>
+          <w:rFonts w:eastAsiaTheme="minorHAnsi" w:hint="eastAsia"/>
+          <w:sz w:val="22"/>
+        </w:rPr>
+        <w:t>처리한</w:t>
+      </w:r>
+      <w:r>
+        <w:rPr>
+          <w:rFonts w:eastAsiaTheme="minorHAnsi"/>
+          <w:sz w:val="22"/>
+        </w:rPr>
+        <w:t xml:space="preserve">다. </w:t>
+      </w:r>
+      <w:proofErr w:type="spellStart"/>
+      <w:r>
+        <w:rPr>
+          <w:rFonts w:eastAsiaTheme="minorHAnsi"/>
+          <w:sz w:val="22"/>
+        </w:rPr>
+        <w:t>오탐으로</w:t>
+      </w:r>
+      <w:proofErr w:type="spellEnd"/>
+      <w:r>
+        <w:rPr>
+          <w:rFonts w:eastAsiaTheme="minorHAnsi"/>
+          <w:sz w:val="22"/>
+        </w:rPr>
+        <w:t xml:space="preserve"> 판단된 이벤트는 장기 보관하지 않고 삭제 처리하므로, `</w:t>
+      </w:r>
+      <w:proofErr w:type="spellStart"/>
+      <w:r>
+        <w:rPr>
+          <w:rFonts w:eastAsiaTheme="minorHAnsi"/>
+          <w:sz w:val="22"/>
+        </w:rPr>
+        <w:t>candidate_event</w:t>
+      </w:r>
+      <w:proofErr w:type="spellEnd"/>
+      <w:r>
+        <w:rPr>
+          <w:rFonts w:eastAsiaTheme="minorHAnsi"/>
+          <w:sz w:val="22"/>
+        </w:rPr>
+        <w:t xml:space="preserve">`의 </w:t>
+      </w:r>
+      <w:r>
+        <w:rPr>
+          <w:rFonts w:eastAsiaTheme="minorHAnsi"/>
+          <w:sz w:val="22"/>
+        </w:rPr>
+        <w:br/>
+      </w:r>
+      <w:r>
+        <w:rPr>
+          <w:rFonts w:eastAsiaTheme="minorHAnsi"/>
+          <w:sz w:val="22"/>
+        </w:rPr>
+        <w:t xml:space="preserve">최종 보관 </w:t>
+      </w:r>
+      <w:proofErr w:type="spellStart"/>
+      <w:r>
+        <w:rPr>
+          <w:rFonts w:eastAsiaTheme="minorHAnsi"/>
+          <w:sz w:val="22"/>
+        </w:rPr>
+        <w:t>상태값으로</w:t>
+      </w:r>
+      <w:proofErr w:type="spellEnd"/>
+      <w:r>
+        <w:rPr>
+          <w:rFonts w:eastAsiaTheme="minorHAnsi"/>
+          <w:sz w:val="22"/>
+        </w:rPr>
+        <w:t xml:space="preserve"> `</w:t>
+      </w:r>
+      <w:proofErr w:type="spellStart"/>
+      <w:r>
+        <w:rPr>
+          <w:rFonts w:eastAsiaTheme="minorHAnsi"/>
+          <w:sz w:val="22"/>
+        </w:rPr>
+        <w:t>false_positive</w:t>
+      </w:r>
+      <w:proofErr w:type="spellEnd"/>
+      <w:r>
+        <w:rPr>
+          <w:rFonts w:eastAsiaTheme="minorHAnsi"/>
+          <w:sz w:val="22"/>
+        </w:rPr>
+        <w:t>`</w:t>
+      </w:r>
+      <w:proofErr w:type="spellStart"/>
+      <w:r>
+        <w:rPr>
+          <w:rFonts w:eastAsiaTheme="minorHAnsi"/>
+          <w:sz w:val="22"/>
+        </w:rPr>
+        <w:t>를</w:t>
+      </w:r>
+      <w:proofErr w:type="spellEnd"/>
+      <w:r>
+        <w:rPr>
+          <w:rFonts w:eastAsiaTheme="minorHAnsi"/>
+          <w:sz w:val="22"/>
+        </w:rPr>
+        <w:t xml:space="preserve"> 유지하지 않는다.</w:t>
+      </w:r>
+    </w:p>
+    <w:p>
+      <w:pPr>
+        <w:rPr>
+          <w:rFonts w:eastAsiaTheme="minorHAnsi"/>
+          <w:sz w:val="22"/>
+        </w:rPr>
+      </w:pPr>
+      <w:r>
+        <w:rPr>
+          <w:rFonts w:eastAsiaTheme="minorHAnsi" w:hint="eastAsia"/>
+          <w:sz w:val="22"/>
+        </w:rPr>
+        <w:t>다만</w:t>
+      </w:r>
+      <w:r>
+        <w:rPr>
+          <w:rFonts w:eastAsiaTheme="minorHAnsi"/>
+          <w:sz w:val="22"/>
+        </w:rPr>
+        <w:t xml:space="preserve"> </w:t>
+      </w:r>
+      <w:proofErr w:type="spellStart"/>
+      <w:r>
+        <w:rPr>
+          <w:rFonts w:eastAsiaTheme="minorHAnsi"/>
+          <w:sz w:val="22"/>
+        </w:rPr>
+        <w:t>오탐</w:t>
+      </w:r>
+      <w:proofErr w:type="spellEnd"/>
+      <w:r>
+        <w:rPr>
+          <w:rFonts w:eastAsiaTheme="minorHAnsi"/>
+          <w:sz w:val="22"/>
+        </w:rPr>
+        <w:t xml:space="preserve"> 발생 건수는 모델 성능 개선과 경고 방송 기준 조정을 위해 필요한 경우, </w:t>
+      </w:r>
+      <w:r>
+        <w:rPr>
+          <w:rFonts w:eastAsiaTheme="minorHAnsi"/>
+          <w:sz w:val="22"/>
+        </w:rPr>
+        <w:br/>
+      </w:r>
+      <w:r>
+        <w:rPr>
+          <w:rFonts w:eastAsiaTheme="minorHAnsi"/>
+          <w:sz w:val="22"/>
+        </w:rPr>
+        <w:t xml:space="preserve">개인 식별 가능 정보와 원본 미디어를 제외한 </w:t>
+      </w:r>
+      <w:proofErr w:type="spellStart"/>
+      <w:r>
+        <w:rPr>
+          <w:rFonts w:eastAsiaTheme="minorHAnsi"/>
+          <w:sz w:val="22"/>
+        </w:rPr>
+        <w:t>비식별</w:t>
+      </w:r>
+      <w:proofErr w:type="spellEnd"/>
+      <w:r>
+        <w:rPr>
+          <w:rFonts w:eastAsiaTheme="minorHAnsi"/>
+          <w:sz w:val="22"/>
+        </w:rPr>
+        <w:t xml:space="preserve"> 집계 수준에서만 활용</w:t>
+      </w:r>
+      <w:r>
+        <w:rPr>
+          <w:rFonts w:eastAsiaTheme="minorHAnsi" w:hint="eastAsia"/>
+          <w:sz w:val="22"/>
+        </w:rPr>
+        <w:t>한</w:t>
+      </w:r>
+      <w:r>
+        <w:rPr>
+          <w:rFonts w:eastAsiaTheme="minorHAnsi"/>
+          <w:sz w:val="22"/>
+        </w:rPr>
+        <w:t>다.</w:t>
+      </w:r>
+    </w:p>
+    <w:p>
+      <w:pPr>
+        <w:rPr>
+          <w:rFonts w:eastAsiaTheme="minorHAnsi"/>
         </w:rPr>
       </w:pPr>
     </w:p>
@@ -12152,48 +12990,6 @@
       <w:pPr>
         <w:rPr>
           <w:rFonts w:eastAsiaTheme="minorHAnsi"/>
-        </w:rPr>
-      </w:pPr>
-    </w:p>
-    <w:p>
-      <w:pPr>
-        <w:rPr>
-          <w:rFonts w:eastAsiaTheme="minorHAnsi"/>
-        </w:rPr>
-      </w:pPr>
-    </w:p>
-    <w:p>
-      <w:pPr>
-        <w:rPr>
-          <w:rFonts w:eastAsiaTheme="minorHAnsi"/>
-        </w:rPr>
-      </w:pPr>
-    </w:p>
-    <w:p>
-      <w:pPr>
-        <w:rPr>
-          <w:rFonts w:eastAsiaTheme="minorHAnsi"/>
-        </w:rPr>
-      </w:pPr>
-    </w:p>
-    <w:p>
-      <w:pPr>
-        <w:rPr>
-          <w:rFonts w:eastAsiaTheme="minorHAnsi"/>
-        </w:rPr>
-      </w:pPr>
-    </w:p>
-    <w:p>
-      <w:pPr>
-        <w:rPr>
-          <w:rFonts w:eastAsiaTheme="minorHAnsi"/>
-        </w:rPr>
-      </w:pPr>
-    </w:p>
-    <w:p>
-      <w:pPr>
-        <w:rPr>
-          <w:rFonts w:eastAsiaTheme="minorHAnsi" w:hint="eastAsia"/>
         </w:rPr>
       </w:pPr>
     </w:p>
@@ -12783,6 +13579,17 @@
             </w:pPr>
             <w:r>
               <w:rPr>
+                <w:rFonts w:eastAsiaTheme="minorHAnsi" w:cs="굴림" w:hint="eastAsia"/>
+                <w:b/>
+                <w:bCs/>
+                <w:kern w:val="0"/>
+                <w:sz w:val="24"/>
+                <w:szCs w:val="24"/>
+              </w:rPr>
+              <w:t xml:space="preserve">담당자 </w:t>
+            </w:r>
+            <w:r>
+              <w:rPr>
                 <w:rFonts w:eastAsiaTheme="minorHAnsi" w:cs="굴림"/>
                 <w:b/>
                 <w:bCs/>
@@ -13437,6 +14244,319 @@
       <w:pPr>
         <w:rPr>
           <w:rFonts w:eastAsiaTheme="minorHAnsi"/>
+          <w:sz w:val="22"/>
+        </w:rPr>
+      </w:pPr>
+      <w:r>
+        <w:rPr>
+          <w:rFonts w:eastAsiaTheme="minorHAnsi"/>
+          <w:sz w:val="22"/>
+        </w:rPr>
+        <w:t>`</w:t>
+      </w:r>
+      <w:proofErr w:type="spellStart"/>
+      <w:r>
+        <w:rPr>
+          <w:rFonts w:eastAsiaTheme="minorHAnsi"/>
+          <w:sz w:val="22"/>
+        </w:rPr>
+        <w:t>review_result</w:t>
+      </w:r>
+      <w:proofErr w:type="spellEnd"/>
+      <w:r>
+        <w:rPr>
+          <w:rFonts w:eastAsiaTheme="minorHAnsi"/>
+          <w:sz w:val="22"/>
+        </w:rPr>
+        <w:t xml:space="preserve">`는 </w:t>
+      </w:r>
+      <w:r>
+        <w:rPr>
+          <w:rFonts w:eastAsiaTheme="minorHAnsi" w:hint="eastAsia"/>
+          <w:sz w:val="22"/>
+        </w:rPr>
+        <w:t>담당자가</w:t>
+      </w:r>
+      <w:r>
+        <w:rPr>
+          <w:rFonts w:eastAsiaTheme="minorHAnsi"/>
+          <w:sz w:val="22"/>
+        </w:rPr>
+        <w:t xml:space="preserve"> 후보 이벤트를 검토한 결과를 의미한다. `confirmed`는 실제 </w:t>
+      </w:r>
+      <w:r>
+        <w:rPr>
+          <w:rFonts w:eastAsiaTheme="minorHAnsi"/>
+          <w:sz w:val="22"/>
+        </w:rPr>
+        <w:br/>
+      </w:r>
+      <w:r>
+        <w:rPr>
+          <w:rFonts w:eastAsiaTheme="minorHAnsi"/>
+          <w:sz w:val="22"/>
+        </w:rPr>
+        <w:t>위반으로 확정된 경우, `</w:t>
+      </w:r>
+      <w:proofErr w:type="spellStart"/>
+      <w:r>
+        <w:rPr>
+          <w:rFonts w:eastAsiaTheme="minorHAnsi"/>
+          <w:sz w:val="22"/>
+        </w:rPr>
+        <w:t>false_positive</w:t>
+      </w:r>
+      <w:proofErr w:type="spellEnd"/>
+      <w:r>
+        <w:rPr>
+          <w:rFonts w:eastAsiaTheme="minorHAnsi"/>
+          <w:sz w:val="22"/>
+        </w:rPr>
+        <w:t xml:space="preserve">`는 </w:t>
+      </w:r>
+      <w:proofErr w:type="spellStart"/>
+      <w:r>
+        <w:rPr>
+          <w:rFonts w:eastAsiaTheme="minorHAnsi"/>
+          <w:sz w:val="22"/>
+        </w:rPr>
+        <w:t>오탐으로</w:t>
+      </w:r>
+      <w:proofErr w:type="spellEnd"/>
+      <w:r>
+        <w:rPr>
+          <w:rFonts w:eastAsiaTheme="minorHAnsi"/>
+          <w:sz w:val="22"/>
+        </w:rPr>
+        <w:t xml:space="preserve"> 판단된 경우, `hold`는 추가 검토가 </w:t>
+      </w:r>
+      <w:r>
+        <w:rPr>
+          <w:rFonts w:eastAsiaTheme="minorHAnsi"/>
+          <w:sz w:val="22"/>
+        </w:rPr>
+        <w:br/>
+      </w:r>
+      <w:r>
+        <w:rPr>
+          <w:rFonts w:eastAsiaTheme="minorHAnsi"/>
+          <w:sz w:val="22"/>
+        </w:rPr>
+        <w:t>필요한 경우를 의미한다.</w:t>
+      </w:r>
+    </w:p>
+    <w:p>
+      <w:pPr>
+        <w:rPr>
+          <w:rFonts w:eastAsiaTheme="minorHAnsi"/>
+          <w:sz w:val="22"/>
+        </w:rPr>
+      </w:pPr>
+      <w:r>
+        <w:rPr>
+          <w:rFonts w:eastAsiaTheme="minorHAnsi"/>
+          <w:sz w:val="22"/>
+        </w:rPr>
+        <w:t>`</w:t>
+      </w:r>
+      <w:proofErr w:type="spellStart"/>
+      <w:r>
+        <w:rPr>
+          <w:rFonts w:eastAsiaTheme="minorHAnsi"/>
+          <w:sz w:val="22"/>
+        </w:rPr>
+        <w:t>review_result</w:t>
+      </w:r>
+      <w:proofErr w:type="spellEnd"/>
+      <w:r>
+        <w:rPr>
+          <w:rFonts w:eastAsiaTheme="minorHAnsi"/>
+          <w:sz w:val="22"/>
+        </w:rPr>
+        <w:t xml:space="preserve">`가 `confirmed`인 경우 원본 이미지와 영상은 삭제하고, 구역, 공정, PPE </w:t>
+      </w:r>
+      <w:r>
+        <w:rPr>
+          <w:rFonts w:eastAsiaTheme="minorHAnsi"/>
+          <w:sz w:val="22"/>
+        </w:rPr>
+        <w:br/>
+      </w:r>
+      <w:r>
+        <w:rPr>
+          <w:rFonts w:eastAsiaTheme="minorHAnsi"/>
+          <w:sz w:val="22"/>
+        </w:rPr>
+        <w:t xml:space="preserve">유형, 발생 시각, 검토 결과 등 </w:t>
+      </w:r>
+      <w:proofErr w:type="spellStart"/>
+      <w:r>
+        <w:rPr>
+          <w:rFonts w:eastAsiaTheme="minorHAnsi"/>
+          <w:sz w:val="22"/>
+        </w:rPr>
+        <w:t>비식별</w:t>
+      </w:r>
+      <w:proofErr w:type="spellEnd"/>
+      <w:r>
+        <w:rPr>
+          <w:rFonts w:eastAsiaTheme="minorHAnsi"/>
+          <w:sz w:val="22"/>
+        </w:rPr>
+        <w:t xml:space="preserve"> 확정 위반 데이터만 분기별 통계에 반영한다.</w:t>
+      </w:r>
+    </w:p>
+    <w:p>
+      <w:pPr>
+        <w:rPr>
+          <w:rFonts w:eastAsiaTheme="minorHAnsi"/>
+          <w:sz w:val="22"/>
+        </w:rPr>
+      </w:pPr>
+      <w:r>
+        <w:rPr>
+          <w:rFonts w:eastAsiaTheme="minorHAnsi"/>
+          <w:sz w:val="22"/>
+        </w:rPr>
+        <w:t>`</w:t>
+      </w:r>
+      <w:proofErr w:type="spellStart"/>
+      <w:r>
+        <w:rPr>
+          <w:rFonts w:eastAsiaTheme="minorHAnsi"/>
+          <w:sz w:val="22"/>
+        </w:rPr>
+        <w:t>review_result</w:t>
+      </w:r>
+      <w:proofErr w:type="spellEnd"/>
+      <w:r>
+        <w:rPr>
+          <w:rFonts w:eastAsiaTheme="minorHAnsi"/>
+          <w:sz w:val="22"/>
+        </w:rPr>
+        <w:t>`가 `</w:t>
+      </w:r>
+      <w:proofErr w:type="spellStart"/>
+      <w:r>
+        <w:rPr>
+          <w:rFonts w:eastAsiaTheme="minorHAnsi"/>
+          <w:sz w:val="22"/>
+        </w:rPr>
+        <w:t>false_positive</w:t>
+      </w:r>
+      <w:proofErr w:type="spellEnd"/>
+      <w:r>
+        <w:rPr>
+          <w:rFonts w:eastAsiaTheme="minorHAnsi"/>
+          <w:sz w:val="22"/>
+        </w:rPr>
+        <w:t xml:space="preserve">`인 경우 </w:t>
+      </w:r>
+      <w:proofErr w:type="spellStart"/>
+      <w:r>
+        <w:rPr>
+          <w:rFonts w:eastAsiaTheme="minorHAnsi"/>
+          <w:sz w:val="22"/>
+        </w:rPr>
+        <w:t>오탐으로</w:t>
+      </w:r>
+      <w:proofErr w:type="spellEnd"/>
+      <w:r>
+        <w:rPr>
+          <w:rFonts w:eastAsiaTheme="minorHAnsi"/>
+          <w:sz w:val="22"/>
+        </w:rPr>
+        <w:t xml:space="preserve"> 판단하여 원본 이미지, 영상, </w:t>
+      </w:r>
+      <w:r>
+        <w:rPr>
+          <w:rFonts w:eastAsiaTheme="minorHAnsi"/>
+          <w:sz w:val="22"/>
+        </w:rPr>
+        <w:br/>
+      </w:r>
+      <w:r>
+        <w:rPr>
+          <w:rFonts w:eastAsiaTheme="minorHAnsi"/>
+          <w:sz w:val="22"/>
+        </w:rPr>
+        <w:t xml:space="preserve">후보 이벤트 상세 기록을 삭제 처리한다. 단, 모델 성능 개선과 경고 방송 기준 조정을 위해 필요한 경우 개인 식별 가능 정보와 원본 미디어를 제외한 </w:t>
+      </w:r>
+      <w:proofErr w:type="spellStart"/>
+      <w:r>
+        <w:rPr>
+          <w:rFonts w:eastAsiaTheme="minorHAnsi"/>
+          <w:sz w:val="22"/>
+        </w:rPr>
+        <w:t>비식별</w:t>
+      </w:r>
+      <w:proofErr w:type="spellEnd"/>
+      <w:r>
+        <w:rPr>
+          <w:rFonts w:eastAsiaTheme="minorHAnsi"/>
+          <w:sz w:val="22"/>
+        </w:rPr>
+        <w:t xml:space="preserve"> 집계 수준의 </w:t>
+      </w:r>
+      <w:r>
+        <w:rPr>
+          <w:rFonts w:eastAsiaTheme="minorHAnsi"/>
+          <w:sz w:val="22"/>
+        </w:rPr>
+        <w:br/>
+      </w:r>
+      <w:proofErr w:type="spellStart"/>
+      <w:r>
+        <w:rPr>
+          <w:rFonts w:eastAsiaTheme="minorHAnsi"/>
+          <w:sz w:val="22"/>
+        </w:rPr>
+        <w:t>오탐</w:t>
+      </w:r>
+      <w:proofErr w:type="spellEnd"/>
+      <w:r>
+        <w:rPr>
+          <w:rFonts w:eastAsiaTheme="minorHAnsi"/>
+          <w:sz w:val="22"/>
+        </w:rPr>
+        <w:t xml:space="preserve"> 건수만 활용할 수 있다.</w:t>
+      </w:r>
+    </w:p>
+    <w:p>
+      <w:pPr>
+        <w:rPr>
+          <w:rFonts w:eastAsiaTheme="minorHAnsi"/>
+          <w:sz w:val="22"/>
+        </w:rPr>
+      </w:pPr>
+      <w:r>
+        <w:rPr>
+          <w:rFonts w:eastAsiaTheme="minorHAnsi"/>
+          <w:sz w:val="22"/>
+        </w:rPr>
+        <w:t>`</w:t>
+      </w:r>
+      <w:proofErr w:type="spellStart"/>
+      <w:r>
+        <w:rPr>
+          <w:rFonts w:eastAsiaTheme="minorHAnsi"/>
+          <w:sz w:val="22"/>
+        </w:rPr>
+        <w:t>review_result</w:t>
+      </w:r>
+      <w:proofErr w:type="spellEnd"/>
+      <w:r>
+        <w:rPr>
+          <w:rFonts w:eastAsiaTheme="minorHAnsi"/>
+          <w:sz w:val="22"/>
+        </w:rPr>
+        <w:t>`가 `hold`인 경우 판단 보류 상태로 처리하며, 추가 검토가 필요한 이벤트로 관리한다.</w:t>
+      </w:r>
+    </w:p>
+    <w:p>
+      <w:pPr>
+        <w:rPr>
+          <w:rFonts w:eastAsiaTheme="minorHAnsi"/>
         </w:rPr>
       </w:pPr>
     </w:p>
@@ -13458,55 +14578,6 @@
       <w:pPr>
         <w:rPr>
           <w:rFonts w:eastAsiaTheme="minorHAnsi"/>
-        </w:rPr>
-      </w:pPr>
-    </w:p>
-    <w:p>
-      <w:pPr>
-        <w:rPr>
-          <w:rFonts w:eastAsiaTheme="minorHAnsi"/>
-        </w:rPr>
-      </w:pPr>
-    </w:p>
-    <w:p>
-      <w:pPr>
-        <w:rPr>
-          <w:rFonts w:eastAsiaTheme="minorHAnsi"/>
-        </w:rPr>
-      </w:pPr>
-    </w:p>
-    <w:p>
-      <w:pPr>
-        <w:rPr>
-          <w:rFonts w:eastAsiaTheme="minorHAnsi"/>
-        </w:rPr>
-      </w:pPr>
-    </w:p>
-    <w:p>
-      <w:pPr>
-        <w:rPr>
-          <w:rFonts w:eastAsiaTheme="minorHAnsi"/>
-        </w:rPr>
-      </w:pPr>
-    </w:p>
-    <w:p>
-      <w:pPr>
-        <w:rPr>
-          <w:rFonts w:eastAsiaTheme="minorHAnsi"/>
-        </w:rPr>
-      </w:pPr>
-    </w:p>
-    <w:p>
-      <w:pPr>
-        <w:rPr>
-          <w:rFonts w:eastAsiaTheme="minorHAnsi"/>
-        </w:rPr>
-      </w:pPr>
-    </w:p>
-    <w:p>
-      <w:pPr>
-        <w:rPr>
-          <w:rFonts w:eastAsiaTheme="minorHAnsi" w:hint="eastAsia"/>
         </w:rPr>
       </w:pPr>
     </w:p>
@@ -14562,6 +15633,30 @@
                 <w:szCs w:val="24"/>
               </w:rPr>
             </w:pPr>
+            <w:proofErr w:type="spellStart"/>
+            <w:r>
+              <w:rPr>
+                <w:rFonts w:eastAsiaTheme="minorHAnsi" w:cs="굴림" w:hint="eastAsia"/>
+                <w:b/>
+                <w:bCs/>
+                <w:kern w:val="0"/>
+                <w:sz w:val="24"/>
+                <w:szCs w:val="24"/>
+              </w:rPr>
+              <w:t>비식별</w:t>
+            </w:r>
+            <w:proofErr w:type="spellEnd"/>
+            <w:r>
+              <w:rPr>
+                <w:rFonts w:eastAsiaTheme="minorHAnsi" w:cs="굴림" w:hint="eastAsia"/>
+                <w:b/>
+                <w:bCs/>
+                <w:kern w:val="0"/>
+                <w:sz w:val="24"/>
+                <w:szCs w:val="24"/>
+              </w:rPr>
+              <w:t xml:space="preserve"> </w:t>
+            </w:r>
             <w:r>
               <w:rPr>
                 <w:rFonts w:eastAsiaTheme="minorHAnsi" w:cs="굴림"/>
@@ -14681,6 +15776,30 @@
             <w:proofErr w:type="spellStart"/>
             <w:r>
               <w:rPr>
+                <w:rFonts w:eastAsiaTheme="minorHAnsi" w:cs="굴림" w:hint="eastAsia"/>
+                <w:b/>
+                <w:bCs/>
+                <w:kern w:val="0"/>
+                <w:sz w:val="24"/>
+                <w:szCs w:val="24"/>
+              </w:rPr>
+              <w:t>비식별</w:t>
+            </w:r>
+            <w:proofErr w:type="spellEnd"/>
+            <w:r>
+              <w:rPr>
+                <w:rFonts w:eastAsiaTheme="minorHAnsi" w:cs="굴림" w:hint="eastAsia"/>
+                <w:b/>
+                <w:bCs/>
+                <w:kern w:val="0"/>
+                <w:sz w:val="24"/>
+                <w:szCs w:val="24"/>
+              </w:rPr>
+              <w:t xml:space="preserve"> 집계 </w:t>
+            </w:r>
+            <w:proofErr w:type="spellStart"/>
+            <w:r>
+              <w:rPr>
                 <w:rFonts w:eastAsiaTheme="minorHAnsi" w:cs="굴림"/>
                 <w:b/>
                 <w:bCs/>
@@ -15326,6 +16445,158 @@
       <w:pPr>
         <w:rPr>
           <w:rFonts w:eastAsiaTheme="minorHAnsi"/>
+          <w:sz w:val="22"/>
+        </w:rPr>
+      </w:pPr>
+      <w:r>
+        <w:rPr>
+          <w:rFonts w:eastAsiaTheme="minorHAnsi"/>
+          <w:sz w:val="22"/>
+        </w:rPr>
+        <w:t>`</w:t>
+      </w:r>
+      <w:proofErr w:type="spellStart"/>
+      <w:r>
+        <w:rPr>
+          <w:rFonts w:eastAsiaTheme="minorHAnsi"/>
+          <w:sz w:val="22"/>
+        </w:rPr>
+        <w:t>quarterly_stats</w:t>
+      </w:r>
+      <w:proofErr w:type="spellEnd"/>
+      <w:r>
+        <w:rPr>
+          <w:rFonts w:eastAsiaTheme="minorHAnsi"/>
+          <w:sz w:val="22"/>
+        </w:rPr>
+        <w:t xml:space="preserve">` 테이블에는 원본 이미지나 영상이 직접 저장되지 않는다. 확정 위반 </w:t>
+      </w:r>
+      <w:r>
+        <w:rPr>
+          <w:rFonts w:eastAsiaTheme="minorHAnsi"/>
+          <w:sz w:val="22"/>
+        </w:rPr>
+        <w:br/>
+      </w:r>
+      <w:r>
+        <w:rPr>
+          <w:rFonts w:eastAsiaTheme="minorHAnsi"/>
+          <w:sz w:val="22"/>
+        </w:rPr>
+        <w:t xml:space="preserve">데이터는 감독관 검토 후 원본 이미지와 영상이 삭제된 뒤, </w:t>
+      </w:r>
+      <w:proofErr w:type="spellStart"/>
+      <w:r>
+        <w:rPr>
+          <w:rFonts w:eastAsiaTheme="minorHAnsi"/>
+          <w:sz w:val="22"/>
+        </w:rPr>
+        <w:t>비식별</w:t>
+      </w:r>
+      <w:proofErr w:type="spellEnd"/>
+      <w:r>
+        <w:rPr>
+          <w:rFonts w:eastAsiaTheme="minorHAnsi"/>
+          <w:sz w:val="22"/>
+        </w:rPr>
+        <w:t xml:space="preserve"> 처리된 집계 데이터로만 반영한다.</w:t>
+      </w:r>
+    </w:p>
+    <w:p>
+      <w:pPr>
+        <w:rPr>
+          <w:rFonts w:eastAsiaTheme="minorHAnsi"/>
+          <w:sz w:val="22"/>
+        </w:rPr>
+      </w:pPr>
+      <w:r>
+        <w:rPr>
+          <w:rFonts w:eastAsiaTheme="minorHAnsi"/>
+          <w:sz w:val="22"/>
+        </w:rPr>
+        <w:t>`</w:t>
+      </w:r>
+      <w:proofErr w:type="spellStart"/>
+      <w:r>
+        <w:rPr>
+          <w:rFonts w:eastAsiaTheme="minorHAnsi"/>
+          <w:sz w:val="22"/>
+        </w:rPr>
+        <w:t>false_positive_count</w:t>
+      </w:r>
+      <w:proofErr w:type="spellEnd"/>
+      <w:r>
+        <w:rPr>
+          <w:rFonts w:eastAsiaTheme="minorHAnsi"/>
+          <w:sz w:val="22"/>
+        </w:rPr>
+        <w:t xml:space="preserve">`는 </w:t>
+      </w:r>
+      <w:proofErr w:type="spellStart"/>
+      <w:r>
+        <w:rPr>
+          <w:rFonts w:eastAsiaTheme="minorHAnsi"/>
+          <w:sz w:val="22"/>
+        </w:rPr>
+        <w:t>오탐</w:t>
+      </w:r>
+      <w:proofErr w:type="spellEnd"/>
+      <w:r>
+        <w:rPr>
+          <w:rFonts w:eastAsiaTheme="minorHAnsi"/>
+          <w:sz w:val="22"/>
+        </w:rPr>
+        <w:t xml:space="preserve"> 이벤트의 상세 기록을 보관하기 위한 값이 아</w:t>
+      </w:r>
+      <w:r>
+        <w:rPr>
+          <w:rFonts w:eastAsiaTheme="minorHAnsi" w:hint="eastAsia"/>
+          <w:sz w:val="22"/>
+        </w:rPr>
+        <w:t>닌</w:t>
+      </w:r>
+      <w:r>
+        <w:rPr>
+          <w:rFonts w:eastAsiaTheme="minorHAnsi"/>
+          <w:sz w:val="22"/>
+        </w:rPr>
+        <w:t xml:space="preserve">, 모델 성능 개선과 경고 방송 기준 조정을 위한 </w:t>
+      </w:r>
+      <w:proofErr w:type="spellStart"/>
+      <w:r>
+        <w:rPr>
+          <w:rFonts w:eastAsiaTheme="minorHAnsi"/>
+          <w:sz w:val="22"/>
+        </w:rPr>
+        <w:t>비식별</w:t>
+      </w:r>
+      <w:proofErr w:type="spellEnd"/>
+      <w:r>
+        <w:rPr>
+          <w:rFonts w:eastAsiaTheme="minorHAnsi"/>
+          <w:sz w:val="22"/>
+        </w:rPr>
+        <w:t xml:space="preserve"> 집계 지표로</w:t>
+      </w:r>
+      <w:r>
+        <w:rPr>
+          <w:rFonts w:eastAsiaTheme="minorHAnsi" w:hint="eastAsia"/>
+          <w:sz w:val="22"/>
+        </w:rPr>
+        <w:t>만</w:t>
+      </w:r>
+      <w:r>
+        <w:rPr>
+          <w:rFonts w:eastAsiaTheme="minorHAnsi"/>
+          <w:sz w:val="22"/>
+        </w:rPr>
+        <w:t xml:space="preserve"> 활용한다.</w:t>
+      </w:r>
+    </w:p>
+    <w:p>
+      <w:pPr>
+        <w:rPr>
+          <w:rFonts w:eastAsiaTheme="minorHAnsi"/>
         </w:rPr>
       </w:pPr>
     </w:p>
@@ -15361,34 +16632,6 @@
       <w:pPr>
         <w:rPr>
           <w:rFonts w:eastAsiaTheme="minorHAnsi"/>
-        </w:rPr>
-      </w:pPr>
-    </w:p>
-    <w:p>
-      <w:pPr>
-        <w:rPr>
-          <w:rFonts w:eastAsiaTheme="minorHAnsi"/>
-        </w:rPr>
-      </w:pPr>
-    </w:p>
-    <w:p>
-      <w:pPr>
-        <w:rPr>
-          <w:rFonts w:eastAsiaTheme="minorHAnsi"/>
-        </w:rPr>
-      </w:pPr>
-    </w:p>
-    <w:p>
-      <w:pPr>
-        <w:rPr>
-          <w:rFonts w:eastAsiaTheme="minorHAnsi"/>
-        </w:rPr>
-      </w:pPr>
-    </w:p>
-    <w:p>
-      <w:pPr>
-        <w:rPr>
-          <w:rFonts w:eastAsiaTheme="minorHAnsi" w:hint="eastAsia"/>
         </w:rPr>
       </w:pPr>
     </w:p>
@@ -16526,8 +17769,8 @@
         <w:tblLook w:val="04A0" w:firstRow="1" w:lastRow="0" w:firstColumn="1" w:lastColumn="0" w:noHBand="0" w:noVBand="1"/>
       </w:tblPr>
       <w:tblGrid>
-        <w:gridCol w:w="4442"/>
-        <w:gridCol w:w="4584"/>
+        <w:gridCol w:w="4424"/>
+        <w:gridCol w:w="4602"/>
       </w:tblGrid>
       <w:tr>
         <w:trPr>
@@ -16959,7 +18202,42 @@
                 <w:sz w:val="24"/>
                 <w:szCs w:val="24"/>
               </w:rPr>
-              <w:t>검토 결과 중 확정 위반 데이터만 분기 통계에 반영한다.</w:t>
+              <w:t xml:space="preserve">검토 결과 중 </w:t>
+            </w:r>
+            <w:proofErr w:type="spellStart"/>
+            <w:r>
+              <w:rPr>
+                <w:rFonts w:eastAsiaTheme="minorHAnsi" w:cs="굴림" w:hint="eastAsia"/>
+                <w:b/>
+                <w:bCs/>
+                <w:kern w:val="0"/>
+                <w:sz w:val="24"/>
+                <w:szCs w:val="24"/>
+              </w:rPr>
+              <w:t>비식별</w:t>
+            </w:r>
+            <w:proofErr w:type="spellEnd"/>
+            <w:r>
+              <w:rPr>
+                <w:rFonts w:eastAsiaTheme="minorHAnsi" w:cs="굴림" w:hint="eastAsia"/>
+                <w:b/>
+                <w:bCs/>
+                <w:kern w:val="0"/>
+                <w:sz w:val="24"/>
+                <w:szCs w:val="24"/>
+              </w:rPr>
+              <w:t xml:space="preserve"> </w:t>
+            </w:r>
+            <w:r>
+              <w:rPr>
+                <w:rFonts w:eastAsiaTheme="minorHAnsi" w:cs="굴림"/>
+                <w:b/>
+                <w:bCs/>
+                <w:kern w:val="0"/>
+                <w:sz w:val="24"/>
+                <w:szCs w:val="24"/>
+              </w:rPr>
+              <w:t>확정 위반 데이터만 분기 통계에 반영한다.</w:t>
             </w:r>
           </w:p>
         </w:tc>
@@ -17071,9 +18349,124 @@
     <w:p>
       <w:pPr>
         <w:rPr>
+          <w:rFonts w:eastAsiaTheme="minorHAnsi"/>
+          <w:sz w:val="22"/>
+        </w:rPr>
+      </w:pPr>
+      <w:r>
+        <w:rPr>
           <w:rFonts w:eastAsiaTheme="minorHAnsi" w:hint="eastAsia"/>
+          <w:sz w:val="22"/>
+        </w:rPr>
+        <w:t>분기별</w:t>
+      </w:r>
+      <w:r>
+        <w:rPr>
+          <w:rFonts w:eastAsiaTheme="minorHAnsi"/>
+          <w:sz w:val="22"/>
+        </w:rPr>
+        <w:t xml:space="preserve"> 통계와 교육 추천에는 원본 이미지나 영상이 직접 사용되지 않는다. </w:t>
+      </w:r>
+      <w:r>
+        <w:rPr>
+          <w:rFonts w:eastAsiaTheme="minorHAnsi"/>
+          <w:sz w:val="22"/>
+        </w:rPr>
+        <w:br/>
+      </w:r>
+      <w:r>
+        <w:rPr>
+          <w:rFonts w:eastAsiaTheme="minorHAnsi"/>
+          <w:sz w:val="22"/>
+        </w:rPr>
+        <w:t xml:space="preserve">장기 분석에는 감독관 검토를 거친 </w:t>
+      </w:r>
+      <w:proofErr w:type="spellStart"/>
+      <w:r>
+        <w:rPr>
+          <w:rFonts w:eastAsiaTheme="minorHAnsi"/>
+          <w:sz w:val="22"/>
+        </w:rPr>
+        <w:t>비식별</w:t>
+      </w:r>
+      <w:proofErr w:type="spellEnd"/>
+      <w:r>
+        <w:rPr>
+          <w:rFonts w:eastAsiaTheme="minorHAnsi"/>
+          <w:sz w:val="22"/>
+        </w:rPr>
+        <w:t xml:space="preserve"> 확정 위반 데이터만 사용한다.</w:t>
+      </w:r>
+    </w:p>
+    <w:p>
+      <w:pPr>
+        <w:rPr>
+          <w:rFonts w:eastAsiaTheme="minorHAnsi"/>
+          <w:sz w:val="22"/>
         </w:rPr>
       </w:pPr>
+      <w:proofErr w:type="spellStart"/>
+      <w:r>
+        <w:rPr>
+          <w:rFonts w:eastAsiaTheme="minorHAnsi" w:hint="eastAsia"/>
+          <w:sz w:val="22"/>
+        </w:rPr>
+        <w:t>오탐으로</w:t>
+      </w:r>
+      <w:proofErr w:type="spellEnd"/>
+      <w:r>
+        <w:rPr>
+          <w:rFonts w:eastAsiaTheme="minorHAnsi"/>
+          <w:sz w:val="22"/>
+        </w:rPr>
+        <w:t xml:space="preserve"> 판단된 이벤트는 삭제 처리하며, 필요한 경우 </w:t>
+      </w:r>
+      <w:proofErr w:type="spellStart"/>
+      <w:r>
+        <w:rPr>
+          <w:rFonts w:eastAsiaTheme="minorHAnsi"/>
+          <w:sz w:val="22"/>
+        </w:rPr>
+        <w:t>비식별</w:t>
+      </w:r>
+      <w:proofErr w:type="spellEnd"/>
+      <w:r>
+        <w:rPr>
+          <w:rFonts w:eastAsiaTheme="minorHAnsi"/>
+          <w:sz w:val="22"/>
+        </w:rPr>
+        <w:t xml:space="preserve"> 집계 수준의 </w:t>
+      </w:r>
+      <w:proofErr w:type="spellStart"/>
+      <w:r>
+        <w:rPr>
+          <w:rFonts w:eastAsiaTheme="minorHAnsi"/>
+          <w:sz w:val="22"/>
+        </w:rPr>
+        <w:t>오탐</w:t>
+      </w:r>
+      <w:proofErr w:type="spellEnd"/>
+      <w:r>
+        <w:rPr>
+          <w:rFonts w:eastAsiaTheme="minorHAnsi"/>
+          <w:sz w:val="22"/>
+        </w:rPr>
+        <w:t xml:space="preserve"> 수만 모델 개선과 경고 방송 기준 조정에 활용</w:t>
+      </w:r>
+      <w:r>
+        <w:rPr>
+          <w:rFonts w:eastAsiaTheme="minorHAnsi" w:hint="eastAsia"/>
+          <w:sz w:val="22"/>
+        </w:rPr>
+        <w:t>한다</w:t>
+      </w:r>
+      <w:r>
+        <w:rPr>
+          <w:rFonts w:eastAsiaTheme="minorHAnsi"/>
+          <w:sz w:val="22"/>
+        </w:rPr>
+        <w:t>.</w:t>
+      </w:r>
     </w:p>
     <w:sectPr>
       <w:pgSz w:w="11906" w:h="16838"/>
@@ -17083,6 +18476,56 @@
     </w:sectPr>
   </w:body>
 </w:document>
+</file>
+
+<file path=word/endnotes.xml><?xml version="1.0" encoding="utf-8"?>
+<w:endnotes xmlns:wpc="http://schemas.microsoft.com/office/word/2010/wordprocessingCanvas" xmlns:cx="http://schemas.microsoft.com/office/drawing/2014/chartex" xmlns:cx1="http://schemas.microsoft.com/office/drawing/2015/9/8/chartex" xmlns:cx2="http://schemas.microsoft.com/office/drawing/2015/10/21/chartex" xmlns:cx3="http://schemas.microsoft.com/office/drawing/2016/5/9/chartex" xmlns:cx4="http://schemas.microsoft.com/office/drawing/2016/5/10/chartex" xmlns:cx5="http://schemas.microsoft.com/office/drawing/2016/5/11/chartex" xmlns:cx6="http://schemas.microsoft.com/office/drawing/2016/5/12/chartex" xmlns:cx7="http://schemas.microsoft.com/office/drawing/2016/5/13/chartex" xmlns:cx8="http://schemas.microsoft.com/office/drawing/2016/5/14/chartex" xmlns:mc="http://schemas.openxmlformats.org/markup-compatibility/2006" xmlns:aink="http://schemas.microsoft.com/office/drawing/2016/ink" xmlns:am3d="http://schemas.microsoft.com/office/drawing/2017/model3d" xmlns:o="urn:schemas-microsoft-com:office:office" xmlns:r="http://schemas.openxmlformats.org/officeDocument/2006/relationships" xmlns:m="http://schemas.openxmlformats.org/officeDocument/2006/math" xmlns:v="urn:schemas-microsoft-com:vml" xmlns:wp14="http://schemas.microsoft.com/office/word/2010/wordprocessingDrawing" xmlns:wp="http://schemas.openxmlformats.org/drawingml/2006/wordprocessingDrawing" xmlns:w10="urn:schemas-microsoft-com:office:word" xmlns:w="http://schemas.openxmlformats.org/wordprocessingml/2006/main" xmlns:w14="http://schemas.microsoft.com/office/word/2010/wordml" xmlns:w15="http://schemas.microsoft.com/office/word/2012/wordml" xmlns:w16cex="http://schemas.microsoft.com/office/word/2018/wordml/cex" xmlns:w16cid="http://schemas.microsoft.com/office/word/2016/wordml/cid" xmlns:w16="http://schemas.microsoft.com/office/word/2018/wordml" xmlns:w16sdtdh="http://schemas.microsoft.com/office/word/2020/wordml/sdtdatahash" xmlns:w16se="http://schemas.microsoft.com/office/word/2015/wordml/symex" xmlns:wpg="http://schemas.microsoft.com/office/word/2010/wordprocessingGroup" xmlns:wpi="http://schemas.microsoft.com/office/word/2010/wordprocessingInk" xmlns:wne="http://schemas.microsoft.com/office/word/2006/wordml" xmlns:wps="http://schemas.microsoft.com/office/word/2010/wordprocessingShape" mc:Ignorable="w14 w15 w16se w16cid w16 w16cex w16sdtdh wp14">
+  <w:endnote w:type="separator" w:id="-1">
+    <w:p>
+      <w:pPr>
+        <w:spacing w:after="0" w:line="240" w:lineRule="auto"/>
+      </w:pPr>
+      <w:r>
+        <w:separator/>
+      </w:r>
+    </w:p>
+  </w:endnote>
+  <w:endnote w:type="continuationSeparator" w:id="0">
+    <w:p>
+      <w:pPr>
+        <w:spacing w:after="0" w:line="240" w:lineRule="auto"/>
+      </w:pPr>
+      <w:r>
+        <w:continuationSeparator/>
+      </w:r>
+    </w:p>
+  </w:endnote>
+</w:endnotes>
+</file>
+
+<file path=word/footnotes.xml><?xml version="1.0" encoding="utf-8"?>
+<w:footnotes xmlns:wpc="http://schemas.microsoft.com/office/word/2010/wordprocessingCanvas" xmlns:cx="http://schemas.microsoft.com/office/drawing/2014/chartex" xmlns:cx1="http://schemas.microsoft.com/office/drawing/2015/9/8/chartex" xmlns:cx2="http://schemas.microsoft.com/office/drawing/2015/10/21/chartex" xmlns:cx3="http://schemas.microsoft.com/office/drawing/2016/5/9/chartex" xmlns:cx4="http://schemas.microsoft.com/office/drawing/2016/5/10/chartex" xmlns:cx5="http://schemas.microsoft.com/office/drawing/2016/5/11/chartex" xmlns:cx6="http://schemas.microsoft.com/office/drawing/2016/5/12/chartex" xmlns:cx7="http://schemas.microsoft.com/office/drawing/2016/5/13/chartex" xmlns:cx8="http://schemas.microsoft.com/office/drawing/2016/5/14/chartex" xmlns:mc="http://schemas.openxmlformats.org/markup-compatibility/2006" xmlns:aink="http://schemas.microsoft.com/office/drawing/2016/ink" xmlns:am3d="http://schemas.microsoft.com/office/drawing/2017/model3d" xmlns:o="urn:schemas-microsoft-com:office:office" xmlns:r="http://schemas.openxmlformats.org/officeDocument/2006/relationships" xmlns:m="http://schemas.openxmlformats.org/officeDocument/2006/math" xmlns:v="urn:schemas-microsoft-com:vml" xmlns:wp14="http://schemas.microsoft.com/office/word/2010/wordprocessingDrawing" xmlns:wp="http://schemas.openxmlformats.org/drawingml/2006/wordprocessingDrawing" xmlns:w10="urn:schemas-microsoft-com:office:word" xmlns:w="http://schemas.openxmlformats.org/wordprocessingml/2006/main" xmlns:w14="http://schemas.microsoft.com/office/word/2010/wordml" xmlns:w15="http://schemas.microsoft.com/office/word/2012/wordml" xmlns:w16cex="http://schemas.microsoft.com/office/word/2018/wordml/cex" xmlns:w16cid="http://schemas.microsoft.com/office/word/2016/wordml/cid" xmlns:w16="http://schemas.microsoft.com/office/word/2018/wordml" xmlns:w16sdtdh="http://schemas.microsoft.com/office/word/2020/wordml/sdtdatahash" xmlns:w16se="http://schemas.microsoft.com/office/word/2015/wordml/symex" xmlns:wpg="http://schemas.microsoft.com/office/word/2010/wordprocessingGroup" xmlns:wpi="http://schemas.microsoft.com/office/word/2010/wordprocessingInk" xmlns:wne="http://schemas.microsoft.com/office/word/2006/wordml" xmlns:wps="http://schemas.microsoft.com/office/word/2010/wordprocessingShape" mc:Ignorable="w14 w15 w16se w16cid w16 w16cex w16sdtdh wp14">
+  <w:footnote w:type="separator" w:id="-1">
+    <w:p>
+      <w:pPr>
+        <w:spacing w:after="0" w:line="240" w:lineRule="auto"/>
+      </w:pPr>
+      <w:r>
+        <w:separator/>
+      </w:r>
+    </w:p>
+  </w:footnote>
+  <w:footnote w:type="continuationSeparator" w:id="0">
+    <w:p>
+      <w:pPr>
+        <w:spacing w:after="0" w:line="240" w:lineRule="auto"/>
+      </w:pPr>
+      <w:r>
+        <w:continuationSeparator/>
+      </w:r>
+    </w:p>
+  </w:footnote>
+</w:footnotes>
 </file>
 
 <file path=word/numbering.xml><?xml version="1.0" encoding="utf-8"?>
@@ -17794,6 +19237,50 @@
       <w:rFonts w:asciiTheme="majorHAnsi" w:eastAsiaTheme="majorEastAsia" w:hAnsiTheme="majorHAnsi" w:cstheme="majorBidi"/>
     </w:rPr>
   </w:style>
+  <w:style w:type="paragraph" w:styleId="a6">
+    <w:name w:val="header"/>
+    <w:basedOn w:val="a"/>
+    <w:link w:val="Char"/>
+    <w:uiPriority w:val="99"/>
+    <w:unhideWhenUsed/>
+    <w:rsid w:val="00F86831"/>
+    <w:pPr>
+      <w:tabs>
+        <w:tab w:val="center" w:pos="4513"/>
+        <w:tab w:val="right" w:pos="9026"/>
+      </w:tabs>
+      <w:snapToGrid w:val="0"/>
+    </w:pPr>
+  </w:style>
+  <w:style w:type="character" w:customStyle="1" w:styleId="Char">
+    <w:name w:val="머리글 Char"/>
+    <w:basedOn w:val="a0"/>
+    <w:link w:val="a6"/>
+    <w:uiPriority w:val="99"/>
+    <w:rsid w:val="00F86831"/>
+  </w:style>
+  <w:style w:type="paragraph" w:styleId="a7">
+    <w:name w:val="footer"/>
+    <w:basedOn w:val="a"/>
+    <w:link w:val="Char0"/>
+    <w:uiPriority w:val="99"/>
+    <w:unhideWhenUsed/>
+    <w:rsid w:val="00F86831"/>
+    <w:pPr>
+      <w:tabs>
+        <w:tab w:val="center" w:pos="4513"/>
+        <w:tab w:val="right" w:pos="9026"/>
+      </w:tabs>
+      <w:snapToGrid w:val="0"/>
+    </w:pPr>
+  </w:style>
+  <w:style w:type="character" w:customStyle="1" w:styleId="Char0">
+    <w:name w:val="바닥글 Char"/>
+    <w:basedOn w:val="a0"/>
+    <w:link w:val="a7"/>
+    <w:uiPriority w:val="99"/>
+    <w:rsid w:val="00F86831"/>
+  </w:style>
 </w:styles>
 </file>
 

</xml_diff>